<commit_message>
docs: restaura referencias de las 6 imagenes de diagramas y valida estructura OOXML en SIRC_Modelamiento.docx
</commit_message>
<xml_diff>
--- a/docs/architecture/SIRC_Modelamiento (1).docx
+++ b/docs/architecture/SIRC_Modelamiento (1).docx
@@ -1,8 +1,8 @@
 
 <file path=word/document.xml><?xml version="1.0" encoding="utf-8"?>
-<w:document xmlns:ns1="http://schemas.microsoft.com/office/word/2010/wordml" xmlns:ns2="http://schemas.openxmlformats.org/drawingml/2006/wordprocessingDrawing" xmlns:ns3="http://schemas.openxmlformats.org/drawingml/2006/main" xmlns:ns4="http://schemas.openxmlformats.org/drawingml/2006/picture" xmlns:ns5="http://schemas.openxmlformats.org/officeDocument/2006/relationships" xmlns:w="http://schemas.openxmlformats.org/wordprocessingml/2006/main">
+<w:document xmlns:mc="http://schemas.openxmlformats.org/markup-compatibility/2006" xmlns:o="urn:schemas-microsoft-com:office:office" xmlns:r="http://schemas.openxmlformats.org/officeDocument/2006/relationships" xmlns:m="http://schemas.openxmlformats.org/officeDocument/2006/math" xmlns:v="urn:schemas-microsoft-com:vml" xmlns:wp="http://schemas.openxmlformats.org/drawingml/2006/wordprocessingDrawing" xmlns:w10="urn:schemas-microsoft-com:office:word" xmlns:w="http://schemas.openxmlformats.org/wordprocessingml/2006/main" xmlns:wne="http://schemas.microsoft.com/office/word/2006/wordml" xmlns:sl="http://schemas.openxmlformats.org/schemaLibrary/2006/main" xmlns:a="http://schemas.openxmlformats.org/drawingml/2006/main" xmlns:pic="http://schemas.openxmlformats.org/drawingml/2006/picture" xmlns:c="http://schemas.openxmlformats.org/drawingml/2006/chart" xmlns:lc="http://schemas.openxmlformats.org/drawingml/2006/lockedCanvas" xmlns:dgm="http://schemas.openxmlformats.org/drawingml/2006/diagram" xmlns:wps="http://schemas.microsoft.com/office/word/2010/wordprocessingShape" xmlns:wpg="http://schemas.microsoft.com/office/word/2010/wordprocessingGroup" xmlns:w14="http://schemas.microsoft.com/office/word/2010/wordml" xmlns:w15="http://schemas.microsoft.com/office/word/2012/wordml" xmlns:w16="http://schemas.microsoft.com/office/word/2018/wordml" xmlns:w16cex="http://schemas.microsoft.com/office/word/2018/wordml/cex" xmlns:w16cid="http://schemas.microsoft.com/office/word/2016/wordml/cid" xmlns="http://schemas.microsoft.com/office/tasks/2019/documenttasks" xmlns:cr="http://schemas.microsoft.com/office/comments/2020/reactions">
   <w:body>
-    <w:p ns1:paraId="00000001">
+    <w:p>
       <w:pPr>
         <w:pStyle w:val="Title"/>
         <w:jc w:val="center"/>
@@ -15,7 +15,7 @@
         <w:t xml:space="preserve">SIRC</w:t>
       </w:r>
     </w:p>
-    <w:p ns1:paraId="00000002">
+    <w:p>
       <w:pPr>
         <w:jc w:val="center"/>
         <w:rPr/>
@@ -37,7 +37,7 @@
         </w:rPr>
       </w:r>
     </w:p>
-    <w:p ns1:paraId="00000003">
+    <w:p>
       <w:pPr>
         <w:jc w:val="center"/>
         <w:rPr/>
@@ -58,7 +58,7 @@
         </w:rPr>
       </w:r>
     </w:p>
-    <w:p ns1:paraId="00000004">
+    <w:p>
       <w:pPr>
         <w:rPr/>
       </w:pPr>
@@ -68,7 +68,7 @@
         </w:rPr>
       </w:r>
     </w:p>
-    <w:p ns1:paraId="00000005">
+    <w:p>
       <w:pPr>
         <w:rPr/>
       </w:pPr>
@@ -79,7 +79,7 @@
         <w:t xml:space="preserve">SIRC (Sistema de Información de Registro Ciudadano) es una aplicación móvil Android para el registro de ciudadanos en zonas con o sin conexión a Internet. La información se almacena localmente en SQLite y se sincroniza automáticamente con un servidor central (Node.js/Express + PostgreSQL) cuando existe conectividad, garantizando la integridad de los datos incluso ante ediciones concurrentes, duplicados y cortes de conexión.</w:t>
       </w:r>
     </w:p>
-    <w:p ns1:paraId="00000006">
+    <w:p>
       <w:pPr>
         <w:pStyle w:val="Heading2"/>
         <w:rPr/>
@@ -91,7 +91,7 @@
         <w:t xml:space="preserve">Objetivo del sistema</w:t>
       </w:r>
     </w:p>
-    <w:p ns1:paraId="00000007">
+    <w:p>
       <w:pPr>
         <w:keepNext w:val="0"/>
         <w:keepLines w:val="0"/>
@@ -148,7 +148,7 @@
         <w:t xml:space="preserve">Registrar, consultar, editar y eliminar ciudadanos.</w:t>
       </w:r>
     </w:p>
-    <w:p ns1:paraId="00000008">
+    <w:p>
       <w:pPr>
         <w:keepNext w:val="0"/>
         <w:keepLines w:val="0"/>
@@ -205,7 +205,7 @@
         <w:t xml:space="preserve">Operar completamente offline en campo.</w:t>
       </w:r>
     </w:p>
-    <w:p ns1:paraId="00000009">
+    <w:p>
       <w:pPr>
         <w:keepNext w:val="0"/>
         <w:keepLines w:val="0"/>
@@ -262,7 +262,7 @@
         <w:t xml:space="preserve">Sincronizar automáticamente al recuperar conectividad, sin pérdida de datos.</w:t>
       </w:r>
     </w:p>
-    <w:p ns1:paraId="0000000A">
+    <w:p>
       <w:pPr>
         <w:keepNext w:val="0"/>
         <w:keepLines w:val="0"/>
@@ -319,7 +319,7 @@
         <w:t xml:space="preserve">Resolver conflictos de edición concurrente y fusionar duplicados por documento.</w:t>
       </w:r>
     </w:p>
-    <w:p ns1:paraId="0000000B">
+    <w:p>
       <w:pPr>
         <w:keepNext w:val="0"/>
         <w:keepLines w:val="0"/>
@@ -376,7 +376,7 @@
         <w:t xml:space="preserve">Permitir inicio de sesión offline y controlar un único dispositivo activo por usuario.</w:t>
       </w:r>
     </w:p>
-    <w:p ns1:paraId="0000000C">
+    <w:p>
       <w:pPr>
         <w:rPr/>
       </w:pPr>
@@ -389,7 +389,7 @@
         </w:rPr>
       </w:r>
     </w:p>
-    <w:p ns1:paraId="0000000D">
+    <w:p>
       <w:pPr>
         <w:pStyle w:val="Heading1"/>
         <w:rPr/>
@@ -401,7 +401,7 @@
         <w:t xml:space="preserve">1. Actores y Casos de Uso</w:t>
       </w:r>
     </w:p>
-    <w:p ns1:paraId="0000000E">
+    <w:p>
       <w:pPr>
         <w:rPr/>
       </w:pPr>
@@ -412,7 +412,7 @@
         <w:t xml:space="preserve">El sistema define dos actores. El Operador móvil trabaja principalmente en campo, con o sin conexión, y concentra la mayoría de los casos de uso transaccionales. El Administrador opera siempre desde el servidor/backoffice y supervisa dispositivos, auditoría y los casos de fusión que no pudieron resolverse automáticamente.</w:t>
       </w:r>
     </w:p>
-    <w:p ns1:paraId="0000000F">
+    <w:p>
       <w:pPr>
         <w:jc w:val="center"/>
         <w:rPr/>
@@ -420,36 +420,36 @@
       <w:r>
         <w:rPr/>
         <w:drawing>
-          <ns2:inline distB="0" distT="0" distL="0" distR="0">
-            <ns2:extent cx="5760720" cy="2854684"/>
-            <ns2:effectExtent b="0" l="0" r="0" t="0"/>
-            <ns2:docPr id="1" name="image3.png"/>
-            <ns3:graphic>
-              <ns3:graphicData uri="http://schemas.openxmlformats.org/drawingml/2006/picture">
-                <ns4:pic>
-                  <ns4:nvPicPr>
-                    <ns4:cNvPr id="0" name="image3.png"/>
-                    <ns4:cNvPicPr preferRelativeResize="0"/>
-                  </ns4:nvPicPr>
-                  <ns4:blipFill>
-                    <ns3:blip ns5:embed="rId7"/>
-                    <ns3:srcRect b="0" l="0" r="0" t="0"/>
-                    <ns3:stretch>
-                      <ns3:fillRect/>
-                    </ns3:stretch>
-                  </ns4:blipFill>
-                  <ns4:spPr>
-                    <ns3:xfrm>
-                      <ns3:off x="0" y="0"/>
-                      <ns3:ext cx="5760720" cy="2854684"/>
-                    </ns3:xfrm>
-                    <ns3:prstGeom prst="rect"/>
-                    <ns3:ln/>
-                  </ns4:spPr>
-                </ns4:pic>
-              </ns3:graphicData>
-            </ns3:graphic>
-          </ns2:inline>
+          <wp:inline distB="0" distT="0" distL="0" distR="0">
+            <wp:extent cx="5760720" cy="2854684"/>
+            <wp:effectExtent b="0" l="0" r="0" t="0"/>
+            <wp:docPr id="1" name="image3.png"/>
+            <a:graphic>
+              <a:graphicData uri="http://schemas.openxmlformats.org/drawingml/2006/picture">
+                <pic:pic>
+                  <pic:nvPicPr>
+                    <pic:cNvPr id="0" name="image3.png"/>
+                    <pic:cNvPicPr preferRelativeResize="0"/>
+                  </pic:nvPicPr>
+                  <pic:blipFill>
+                    <a:blip r:embed="rId7"/>
+                    <a:srcRect b="0" l="0" r="0" t="0"/>
+                    <a:stretch>
+                      <a:fillRect/>
+                    </a:stretch>
+                  </pic:blipFill>
+                  <pic:spPr>
+                    <a:xfrm>
+                      <a:off x="0" y="0"/>
+                      <a:ext cx="5760720" cy="2854684"/>
+                    </a:xfrm>
+                    <a:prstGeom prst="rect"/>
+                    <a:ln/>
+                  </pic:spPr>
+                </pic:pic>
+              </a:graphicData>
+            </a:graphic>
+          </wp:inline>
         </w:drawing>
       </w:r>
       <w:r>
@@ -458,7 +458,7 @@
         </w:rPr>
       </w:r>
     </w:p>
-    <w:p ns1:paraId="00000010">
+    <w:p>
       <w:pPr>
         <w:jc w:val="center"/>
         <w:rPr/>
@@ -516,7 +516,7 @@
           <w:tcPr>
             <w:shd w:fill="2c5f8a" w:val="clear"/>
           </w:tcPr>
-          <w:p ns1:paraId="00000011">
+          <w:p>
             <w:pPr>
               <w:rPr/>
             </w:pPr>
@@ -538,7 +538,7 @@
           <w:tcPr>
             <w:shd w:fill="2c5f8a" w:val="clear"/>
           </w:tcPr>
-          <w:p ns1:paraId="00000012">
+          <w:p>
             <w:pPr>
               <w:rPr/>
             </w:pPr>
@@ -560,7 +560,7 @@
           <w:tcPr>
             <w:shd w:fill="2c5f8a" w:val="clear"/>
           </w:tcPr>
-          <w:p ns1:paraId="00000013">
+          <w:p>
             <w:pPr>
               <w:rPr/>
             </w:pPr>
@@ -586,7 +586,7 @@
         </w:trPr>
         <w:tc>
           <w:tcPr/>
-          <w:p ns1:paraId="00000014">
+          <w:p>
             <w:pPr>
               <w:rPr/>
             </w:pPr>
@@ -600,7 +600,7 @@
         </w:tc>
         <w:tc>
           <w:tcPr/>
-          <w:p ns1:paraId="00000015">
+          <w:p>
             <w:pPr>
               <w:rPr/>
             </w:pPr>
@@ -614,7 +614,7 @@
         </w:tc>
         <w:tc>
           <w:tcPr/>
-          <w:p ns1:paraId="00000016">
+          <w:p>
             <w:pPr>
               <w:rPr/>
             </w:pPr>
@@ -634,7 +634,7 @@
         </w:trPr>
         <w:tc>
           <w:tcPr/>
-          <w:p ns1:paraId="00000017">
+          <w:p>
             <w:pPr>
               <w:rPr/>
             </w:pPr>
@@ -648,7 +648,7 @@
         </w:tc>
         <w:tc>
           <w:tcPr/>
-          <w:p ns1:paraId="00000018">
+          <w:p>
             <w:pPr>
               <w:rPr/>
             </w:pPr>
@@ -662,7 +662,7 @@
         </w:tc>
         <w:tc>
           <w:tcPr/>
-          <w:p ns1:paraId="00000019">
+          <w:p>
             <w:pPr>
               <w:rPr/>
             </w:pPr>
@@ -682,7 +682,7 @@
         </w:trPr>
         <w:tc>
           <w:tcPr/>
-          <w:p ns1:paraId="0000001A">
+          <w:p>
             <w:pPr>
               <w:rPr/>
             </w:pPr>
@@ -696,7 +696,7 @@
         </w:tc>
         <w:tc>
           <w:tcPr/>
-          <w:p ns1:paraId="0000001B">
+          <w:p>
             <w:pPr>
               <w:rPr/>
             </w:pPr>
@@ -710,7 +710,7 @@
         </w:tc>
         <w:tc>
           <w:tcPr/>
-          <w:p ns1:paraId="0000001C">
+          <w:p>
             <w:pPr>
               <w:rPr/>
             </w:pPr>
@@ -730,7 +730,7 @@
         </w:trPr>
         <w:tc>
           <w:tcPr/>
-          <w:p ns1:paraId="0000001D">
+          <w:p>
             <w:pPr>
               <w:rPr/>
             </w:pPr>
@@ -744,7 +744,7 @@
         </w:tc>
         <w:tc>
           <w:tcPr/>
-          <w:p ns1:paraId="0000001E">
+          <w:p>
             <w:pPr>
               <w:rPr/>
             </w:pPr>
@@ -758,7 +758,7 @@
         </w:tc>
         <w:tc>
           <w:tcPr/>
-          <w:p ns1:paraId="0000001F">
+          <w:p>
             <w:pPr>
               <w:rPr/>
             </w:pPr>
@@ -778,7 +778,7 @@
         </w:trPr>
         <w:tc>
           <w:tcPr/>
-          <w:p ns1:paraId="00000020">
+          <w:p>
             <w:pPr>
               <w:rPr/>
             </w:pPr>
@@ -792,7 +792,7 @@
         </w:tc>
         <w:tc>
           <w:tcPr/>
-          <w:p ns1:paraId="00000021">
+          <w:p>
             <w:pPr>
               <w:rPr/>
             </w:pPr>
@@ -806,7 +806,7 @@
         </w:tc>
         <w:tc>
           <w:tcPr/>
-          <w:p ns1:paraId="00000022">
+          <w:p>
             <w:pPr>
               <w:rPr/>
             </w:pPr>
@@ -826,7 +826,7 @@
         </w:trPr>
         <w:tc>
           <w:tcPr/>
-          <w:p ns1:paraId="00000023">
+          <w:p>
             <w:pPr>
               <w:rPr/>
             </w:pPr>
@@ -840,7 +840,7 @@
         </w:tc>
         <w:tc>
           <w:tcPr/>
-          <w:p ns1:paraId="00000024">
+          <w:p>
             <w:pPr>
               <w:rPr/>
             </w:pPr>
@@ -854,7 +854,7 @@
         </w:tc>
         <w:tc>
           <w:tcPr/>
-          <w:p ns1:paraId="00000025">
+          <w:p>
             <w:pPr>
               <w:rPr/>
             </w:pPr>
@@ -874,7 +874,7 @@
         </w:trPr>
         <w:tc>
           <w:tcPr/>
-          <w:p ns1:paraId="00000026">
+          <w:p>
             <w:pPr>
               <w:rPr/>
             </w:pPr>
@@ -888,7 +888,7 @@
         </w:tc>
         <w:tc>
           <w:tcPr/>
-          <w:p ns1:paraId="00000027">
+          <w:p>
             <w:pPr>
               <w:rPr/>
             </w:pPr>
@@ -902,7 +902,7 @@
         </w:tc>
         <w:tc>
           <w:tcPr/>
-          <w:p ns1:paraId="00000028">
+          <w:p>
             <w:pPr>
               <w:rPr/>
             </w:pPr>
@@ -922,7 +922,7 @@
         </w:trPr>
         <w:tc>
           <w:tcPr/>
-          <w:p ns1:paraId="00000029">
+          <w:p>
             <w:pPr>
               <w:rPr/>
             </w:pPr>
@@ -936,7 +936,7 @@
         </w:tc>
         <w:tc>
           <w:tcPr/>
-          <w:p ns1:paraId="0000002A">
+          <w:p>
             <w:pPr>
               <w:rPr/>
             </w:pPr>
@@ -950,7 +950,7 @@
         </w:tc>
         <w:tc>
           <w:tcPr/>
-          <w:p ns1:paraId="0000002B">
+          <w:p>
             <w:pPr>
               <w:rPr/>
             </w:pPr>
@@ -970,7 +970,7 @@
         </w:trPr>
         <w:tc>
           <w:tcPr/>
-          <w:p ns1:paraId="0000002C">
+          <w:p>
             <w:pPr>
               <w:rPr/>
             </w:pPr>
@@ -984,7 +984,7 @@
         </w:tc>
         <w:tc>
           <w:tcPr/>
-          <w:p ns1:paraId="0000002D">
+          <w:p>
             <w:pPr>
               <w:rPr/>
             </w:pPr>
@@ -998,7 +998,7 @@
         </w:tc>
         <w:tc>
           <w:tcPr/>
-          <w:p ns1:paraId="0000002E">
+          <w:p>
             <w:pPr>
               <w:rPr/>
             </w:pPr>
@@ -1018,7 +1018,7 @@
         </w:trPr>
         <w:tc>
           <w:tcPr/>
-          <w:p ns1:paraId="0000002F">
+          <w:p>
             <w:pPr>
               <w:rPr/>
             </w:pPr>
@@ -1032,7 +1032,7 @@
         </w:tc>
         <w:tc>
           <w:tcPr/>
-          <w:p ns1:paraId="00000030">
+          <w:p>
             <w:pPr>
               <w:rPr/>
             </w:pPr>
@@ -1046,7 +1046,7 @@
         </w:tc>
         <w:tc>
           <w:tcPr/>
-          <w:p ns1:paraId="00000031">
+          <w:p>
             <w:pPr>
               <w:rPr/>
             </w:pPr>
@@ -1060,7 +1060,7 @@
         </w:tc>
       </w:tr>
     </w:tbl>
-    <w:p ns1:paraId="00000032">
+    <w:p>
       <w:pPr>
         <w:rPr/>
       </w:pPr>
@@ -1073,7 +1073,7 @@
         </w:rPr>
       </w:r>
     </w:p>
-    <w:p ns1:paraId="00000033">
+    <w:p>
       <w:pPr>
         <w:pStyle w:val="Heading1"/>
         <w:rPr/>
@@ -1085,7 +1085,7 @@
         <w:t xml:space="preserve">2. Diagrama de Arquitectura</w:t>
       </w:r>
     </w:p>
-    <w:p ns1:paraId="00000034">
+    <w:p>
       <w:pPr>
         <w:rPr/>
       </w:pPr>
@@ -1096,7 +1096,7 @@
         <w:t xml:space="preserve">Arquitectura offline-first: la app nunca depende de la red para operar. El Repository Pattern abstrae el origen del dato (local o remoto) del resto de la aplicación. El Servicio de Sincronización corre en segundo plano y solo se activa cuando detecta conectividad.</w:t>
       </w:r>
     </w:p>
-    <w:p ns1:paraId="00000035">
+    <w:p>
       <w:pPr>
         <w:jc w:val="center"/>
         <w:rPr/>
@@ -1104,36 +1104,36 @@
       <w:r>
         <w:rPr/>
         <w:drawing>
-          <ns2:inline distB="0" distT="0" distL="0" distR="0">
-            <ns2:extent cx="5099613" cy="6172272"/>
-            <ns2:effectExtent b="0" l="0" r="0" t="0"/>
-            <ns2:docPr id="3" name="image1.png"/>
-            <ns3:graphic>
-              <ns3:graphicData uri="http://schemas.openxmlformats.org/drawingml/2006/picture">
-                <ns4:pic>
-                  <ns4:nvPicPr>
-                    <ns4:cNvPr id="0" name="image1.png"/>
-                    <ns4:cNvPicPr preferRelativeResize="0"/>
-                  </ns4:nvPicPr>
-                  <ns4:blipFill>
-                    <ns3:blip ns5:embed="rId8"/>
-                    <ns3:srcRect b="0" l="0" r="0" t="0"/>
-                    <ns3:stretch>
-                      <ns3:fillRect/>
-                    </ns3:stretch>
-                  </ns4:blipFill>
-                  <ns4:spPr>
-                    <ns3:xfrm>
-                      <ns3:off x="0" y="0"/>
-                      <ns3:ext cx="5099613" cy="6172272"/>
-                    </ns3:xfrm>
-                    <ns3:prstGeom prst="rect"/>
-                    <ns3:ln/>
-                  </ns4:spPr>
-                </ns4:pic>
-              </ns3:graphicData>
-            </ns3:graphic>
-          </ns2:inline>
+          <wp:inline distB="0" distT="0" distL="0" distR="0">
+            <wp:extent cx="5099613" cy="6172272"/>
+            <wp:effectExtent b="0" l="0" r="0" t="0"/>
+            <wp:docPr id="3" name="image1.png"/>
+            <a:graphic>
+              <a:graphicData uri="http://schemas.openxmlformats.org/drawingml/2006/picture">
+                <pic:pic>
+                  <pic:nvPicPr>
+                    <pic:cNvPr id="0" name="image1.png"/>
+                    <pic:cNvPicPr preferRelativeResize="0"/>
+                  </pic:nvPicPr>
+                  <pic:blipFill>
+                    <a:blip r:embed="rId8"/>
+                    <a:srcRect b="0" l="0" r="0" t="0"/>
+                    <a:stretch>
+                      <a:fillRect/>
+                    </a:stretch>
+                  </pic:blipFill>
+                  <pic:spPr>
+                    <a:xfrm>
+                      <a:off x="0" y="0"/>
+                      <a:ext cx="5099613" cy="6172272"/>
+                    </a:xfrm>
+                    <a:prstGeom prst="rect"/>
+                    <a:ln/>
+                  </pic:spPr>
+                </pic:pic>
+              </a:graphicData>
+            </a:graphic>
+          </wp:inline>
         </w:drawing>
       </w:r>
       <w:r>
@@ -1142,7 +1142,7 @@
         </w:rPr>
       </w:r>
     </w:p>
-    <w:p ns1:paraId="00000036">
+    <w:p>
       <w:pPr>
         <w:jc w:val="center"/>
         <w:rPr>
@@ -1163,7 +1163,7 @@
         <w:t xml:space="preserve">Figura 2.1 — Arquitectura general del sistema.</w:t>
       </w:r>
     </w:p>
-    <w:p ns1:paraId="00000037">
+    <w:p>
       <w:pPr>
         <w:jc w:val="center"/>
         <w:rPr>
@@ -1179,7 +1179,7 @@
         </w:rPr>
       </w:r>
     </w:p>
-    <w:p ns1:paraId="00000038">
+    <w:p>
       <w:pPr>
         <w:pStyle w:val="Heading2"/>
         <w:rPr/>
@@ -1226,7 +1226,7 @@
           <w:tcPr>
             <w:shd w:fill="2c5f8a" w:val="clear"/>
           </w:tcPr>
-          <w:p ns1:paraId="00000039">
+          <w:p>
             <w:pPr>
               <w:rPr/>
             </w:pPr>
@@ -1248,7 +1248,7 @@
           <w:tcPr>
             <w:shd w:fill="2c5f8a" w:val="clear"/>
           </w:tcPr>
-          <w:p ns1:paraId="0000003A">
+          <w:p>
             <w:pPr>
               <w:rPr/>
             </w:pPr>
@@ -1274,7 +1274,7 @@
         </w:trPr>
         <w:tc>
           <w:tcPr/>
-          <w:p ns1:paraId="0000003B">
+          <w:p>
             <w:pPr>
               <w:rPr/>
             </w:pPr>
@@ -1288,7 +1288,7 @@
         </w:tc>
         <w:tc>
           <w:tcPr/>
-          <w:p ns1:paraId="0000003C">
+          <w:p>
             <w:pPr>
               <w:rPr/>
             </w:pPr>
@@ -1308,7 +1308,7 @@
         </w:trPr>
         <w:tc>
           <w:tcPr/>
-          <w:p ns1:paraId="0000003D">
+          <w:p>
             <w:pPr>
               <w:rPr/>
             </w:pPr>
@@ -1322,7 +1322,7 @@
         </w:tc>
         <w:tc>
           <w:tcPr/>
-          <w:p ns1:paraId="0000003E">
+          <w:p>
             <w:pPr>
               <w:rPr/>
             </w:pPr>
@@ -1342,7 +1342,7 @@
         </w:trPr>
         <w:tc>
           <w:tcPr/>
-          <w:p ns1:paraId="0000003F">
+          <w:p>
             <w:pPr>
               <w:rPr/>
             </w:pPr>
@@ -1356,7 +1356,7 @@
         </w:tc>
         <w:tc>
           <w:tcPr/>
-          <w:p ns1:paraId="00000040">
+          <w:p>
             <w:pPr>
               <w:rPr/>
             </w:pPr>
@@ -1376,7 +1376,7 @@
         </w:trPr>
         <w:tc>
           <w:tcPr/>
-          <w:p ns1:paraId="00000041">
+          <w:p>
             <w:pPr>
               <w:rPr/>
             </w:pPr>
@@ -1390,7 +1390,7 @@
         </w:tc>
         <w:tc>
           <w:tcPr/>
-          <w:p ns1:paraId="00000042">
+          <w:p>
             <w:pPr>
               <w:rPr/>
             </w:pPr>
@@ -1410,7 +1410,7 @@
         </w:trPr>
         <w:tc>
           <w:tcPr/>
-          <w:p ns1:paraId="00000043">
+          <w:p>
             <w:pPr>
               <w:rPr/>
             </w:pPr>
@@ -1424,7 +1424,7 @@
         </w:tc>
         <w:tc>
           <w:tcPr/>
-          <w:p ns1:paraId="00000044">
+          <w:p>
             <w:pPr>
               <w:rPr/>
             </w:pPr>
@@ -1444,7 +1444,7 @@
         </w:trPr>
         <w:tc>
           <w:tcPr/>
-          <w:p ns1:paraId="00000045">
+          <w:p>
             <w:pPr>
               <w:rPr/>
             </w:pPr>
@@ -1458,7 +1458,7 @@
         </w:tc>
         <w:tc>
           <w:tcPr/>
-          <w:p ns1:paraId="00000046">
+          <w:p>
             <w:pPr>
               <w:rPr/>
             </w:pPr>
@@ -1478,7 +1478,7 @@
         </w:trPr>
         <w:tc>
           <w:tcPr/>
-          <w:p ns1:paraId="00000047">
+          <w:p>
             <w:pPr>
               <w:rPr/>
             </w:pPr>
@@ -1492,7 +1492,7 @@
         </w:tc>
         <w:tc>
           <w:tcPr/>
-          <w:p ns1:paraId="00000048">
+          <w:p>
             <w:pPr>
               <w:rPr/>
             </w:pPr>
@@ -1506,7 +1506,7 @@
         </w:tc>
       </w:tr>
     </w:tbl>
-    <w:p ns1:paraId="00000049">
+    <w:p>
       <w:pPr>
         <w:rPr/>
       </w:pPr>
@@ -1519,7 +1519,7 @@
         </w:rPr>
       </w:r>
     </w:p>
-    <w:p ns1:paraId="0000004A">
+    <w:p>
       <w:pPr>
         <w:pStyle w:val="Heading1"/>
         <w:rPr/>
@@ -1531,7 +1531,7 @@
         <w:t xml:space="preserve">3. Modelo de Datos</w:t>
       </w:r>
     </w:p>
-    <w:p ns1:paraId="0000004B">
+    <w:p>
       <w:pPr>
         <w:pStyle w:val="Heading2"/>
         <w:rPr/>
@@ -1580,7 +1580,7 @@
           <w:tcPr>
             <w:shd w:fill="2c5f8a" w:val="clear"/>
           </w:tcPr>
-          <w:p ns1:paraId="0000004C">
+          <w:p>
             <w:pPr>
               <w:rPr/>
             </w:pPr>
@@ -1602,7 +1602,7 @@
           <w:tcPr>
             <w:shd w:fill="2c5f8a" w:val="clear"/>
           </w:tcPr>
-          <w:p ns1:paraId="0000004D">
+          <w:p>
             <w:pPr>
               <w:rPr/>
             </w:pPr>
@@ -1624,7 +1624,7 @@
           <w:tcPr>
             <w:shd w:fill="2c5f8a" w:val="clear"/>
           </w:tcPr>
-          <w:p ns1:paraId="0000004E">
+          <w:p>
             <w:pPr>
               <w:rPr/>
             </w:pPr>
@@ -1650,7 +1650,7 @@
         </w:trPr>
         <w:tc>
           <w:tcPr/>
-          <w:p ns1:paraId="0000004F">
+          <w:p>
             <w:pPr>
               <w:rPr/>
             </w:pPr>
@@ -1664,7 +1664,7 @@
         </w:tc>
         <w:tc>
           <w:tcPr/>
-          <w:p ns1:paraId="00000050">
+          <w:p>
             <w:pPr>
               <w:rPr/>
             </w:pPr>
@@ -1678,7 +1678,7 @@
         </w:tc>
         <w:tc>
           <w:tcPr/>
-          <w:p ns1:paraId="00000051">
+          <w:p>
             <w:pPr>
               <w:rPr/>
             </w:pPr>
@@ -1698,7 +1698,7 @@
         </w:trPr>
         <w:tc>
           <w:tcPr/>
-          <w:p ns1:paraId="0000004F">
+          <w:p>
             <w:pPr>
               <w:rPr/>
             </w:pPr>
@@ -1712,7 +1712,103 @@
         </w:tc>
         <w:tc>
           <w:tcPr/>
-          <w:p ns1:paraId="00000050">
+          <w:p>
+            <w:pPr>
+              <w:rPr/>
+            </w:pPr>
+            <w:r>
+              <w:rPr>
+                <w:rtl w:val="0"/>
+              </w:rPr>
+              <w:t xml:space="preserve">uuid</w:t>
+            </w:r>
+          </w:p>
+        </w:tc>
+        <w:tc>
+          <w:tcPr/>
+          <w:p>
+            <w:pPr>
+              <w:rPr/>
+            </w:pPr>
+            <w:r>
+              <w:rPr>
+                <w:rtl w:val="0"/>
+              </w:rPr>
+              <w:t xml:space="preserve">UUID identificador único global</w:t>
+            </w:r>
+          </w:p>
+        </w:tc>
+      </w:tr>
+      <w:tr>
+        <w:trPr>
+          <w:cantSplit w:val="0"/>
+          <w:tblHeader w:val="0"/>
+        </w:trPr>
+        <w:tc>
+          <w:tcPr/>
+          <w:p>
+            <w:pPr>
+              <w:rPr/>
+            </w:pPr>
+            <w:r>
+              <w:rPr>
+                <w:rtl w:val="0"/>
+              </w:rPr>
+              <w:t xml:space="preserve">usuarios</w:t>
+            </w:r>
+          </w:p>
+        </w:tc>
+        <w:tc>
+          <w:tcPr/>
+          <w:p>
+            <w:pPr>
+              <w:rPr/>
+            </w:pPr>
+            <w:r>
+              <w:rPr>
+                <w:rtl w:val="0"/>
+              </w:rPr>
+              <w:t xml:space="preserve">nombre</w:t>
+            </w:r>
+          </w:p>
+        </w:tc>
+        <w:tc>
+          <w:tcPr/>
+          <w:p>
+            <w:pPr>
+              <w:rPr/>
+            </w:pPr>
+            <w:r>
+              <w:rPr>
+                <w:rtl w:val="0"/>
+              </w:rPr>
+              <w:t xml:space="preserve">Nombre completo del operador / agente</w:t>
+            </w:r>
+          </w:p>
+        </w:tc>
+      </w:tr>
+      <w:tr>
+        <w:trPr>
+          <w:cantSplit w:val="0"/>
+          <w:tblHeader w:val="0"/>
+        </w:trPr>
+        <w:tc>
+          <w:tcPr/>
+          <w:p>
+            <w:pPr>
+              <w:rPr/>
+            </w:pPr>
+            <w:r>
+              <w:rPr>
+                <w:rtl w:val="0"/>
+              </w:rPr>
+              <w:t xml:space="preserve">usuarios</w:t>
+            </w:r>
+          </w:p>
+        </w:tc>
+        <w:tc>
+          <w:tcPr/>
+          <w:p>
             <w:pPr>
               <w:rPr/>
             </w:pPr>
@@ -1726,7 +1822,7 @@
         </w:tc>
         <w:tc>
           <w:tcPr/>
-          <w:p ns1:paraId="00000051">
+          <w:p>
             <w:pPr>
               <w:rPr/>
             </w:pPr>
@@ -1746,7 +1842,7 @@
         </w:trPr>
         <w:tc>
           <w:tcPr/>
-          <w:p ns1:paraId="0000004F">
+          <w:p>
             <w:pPr>
               <w:rPr/>
             </w:pPr>
@@ -1760,7 +1856,7 @@
         </w:tc>
         <w:tc>
           <w:tcPr/>
-          <w:p ns1:paraId="00000050">
+          <w:p>
             <w:pPr>
               <w:rPr/>
             </w:pPr>
@@ -1774,27 +1870,27 @@
         </w:tc>
         <w:tc>
           <w:tcPr/>
-          <w:p ns1:paraId="00000051">
-            <w:pPr>
-              <w:rPr/>
-            </w:pPr>
-            <w:r>
-              <w:rPr>
-                <w:rtl w:val="0"/>
-              </w:rPr>
-              <w:t xml:space="preserve">Hash bcrypt de contraseña (almacenado en SQLite para login offline)</w:t>
-            </w:r>
-          </w:p>
-        </w:tc>
-      </w:tr>
-      <w:tr>
-        <w:trPr>
-          <w:cantSplit w:val="0"/>
-          <w:tblHeader w:val="0"/>
-        </w:trPr>
-        <w:tc>
-          <w:tcPr/>
-          <w:p ns1:paraId="0000004F">
+          <w:p>
+            <w:pPr>
+              <w:rPr/>
+            </w:pPr>
+            <w:r>
+              <w:rPr>
+                <w:rtl w:val="0"/>
+              </w:rPr>
+              <w:t xml:space="preserve">Hash bcrypt de contraseña (guardado en SQLite para login offline)</w:t>
+            </w:r>
+          </w:p>
+        </w:tc>
+      </w:tr>
+      <w:tr>
+        <w:trPr>
+          <w:cantSplit w:val="0"/>
+          <w:tblHeader w:val="0"/>
+        </w:trPr>
+        <w:tc>
+          <w:tcPr/>
+          <w:p>
             <w:pPr>
               <w:rPr/>
             </w:pPr>
@@ -1808,41 +1904,41 @@
         </w:tc>
         <w:tc>
           <w:tcPr/>
-          <w:p ns1:paraId="00000050">
-            <w:pPr>
-              <w:rPr/>
-            </w:pPr>
-            <w:r>
-              <w:rPr>
-                <w:rtl w:val="0"/>
-              </w:rPr>
-              <w:t xml:space="preserve">nombre</w:t>
-            </w:r>
-          </w:p>
-        </w:tc>
-        <w:tc>
-          <w:tcPr/>
-          <w:p ns1:paraId="00000051">
-            <w:pPr>
-              <w:rPr/>
-            </w:pPr>
-            <w:r>
-              <w:rPr>
-                <w:rtl w:val="0"/>
-              </w:rPr>
-              <w:t xml:space="preserve">Nombre completo del operador / agente</w:t>
-            </w:r>
-          </w:p>
-        </w:tc>
-      </w:tr>
-      <w:tr>
-        <w:trPr>
-          <w:cantSplit w:val="0"/>
-          <w:tblHeader w:val="0"/>
-        </w:trPr>
-        <w:tc>
-          <w:tcPr/>
-          <w:p ns1:paraId="0000004F">
+          <w:p>
+            <w:pPr>
+              <w:rPr/>
+            </w:pPr>
+            <w:r>
+              <w:rPr>
+                <w:rtl w:val="0"/>
+              </w:rPr>
+              <w:t xml:space="preserve">dispositivo_activo_id</w:t>
+            </w:r>
+          </w:p>
+        </w:tc>
+        <w:tc>
+          <w:tcPr/>
+          <w:p>
+            <w:pPr>
+              <w:rPr/>
+            </w:pPr>
+            <w:r>
+              <w:rPr>
+                <w:rtl w:val="0"/>
+              </w:rPr>
+              <w:t xml:space="preserve">FK al dispositivo activo vinculado</w:t>
+            </w:r>
+          </w:p>
+        </w:tc>
+      </w:tr>
+      <w:tr>
+        <w:trPr>
+          <w:cantSplit w:val="0"/>
+          <w:tblHeader w:val="0"/>
+        </w:trPr>
+        <w:tc>
+          <w:tcPr/>
+          <w:p>
             <w:pPr>
               <w:rPr/>
             </w:pPr>
@@ -1856,7 +1952,7 @@
         </w:tc>
         <w:tc>
           <w:tcPr/>
-          <w:p ns1:paraId="00000050">
+          <w:p>
             <w:pPr>
               <w:rPr/>
             </w:pPr>
@@ -1870,7 +1966,7 @@
         </w:tc>
         <w:tc>
           <w:tcPr/>
-          <w:p ns1:paraId="00000051">
+          <w:p>
             <w:pPr>
               <w:rPr/>
             </w:pPr>
@@ -1890,7 +1986,7 @@
         </w:trPr>
         <w:tc>
           <w:tcPr/>
-          <w:p ns1:paraId="0000004F">
+          <w:p>
             <w:pPr>
               <w:rPr/>
             </w:pPr>
@@ -1904,89 +2000,41 @@
         </w:tc>
         <w:tc>
           <w:tcPr/>
-          <w:p ns1:paraId="00000050">
-            <w:pPr>
-              <w:rPr/>
-            </w:pPr>
-            <w:r>
-              <w:rPr>
-                <w:rtl w:val="0"/>
-              </w:rPr>
-              <w:t xml:space="preserve">dispositivo_activo_id</w:t>
-            </w:r>
-          </w:p>
-        </w:tc>
-        <w:tc>
-          <w:tcPr/>
-          <w:p ns1:paraId="00000051">
-            <w:pPr>
-              <w:rPr/>
-            </w:pPr>
-            <w:r>
-              <w:rPr>
-                <w:rtl w:val="0"/>
-              </w:rPr>
-              <w:t xml:space="preserve">FK al dispositivo activo vinculado</w:t>
-            </w:r>
-          </w:p>
-        </w:tc>
-      </w:tr>
-      <w:tr>
-        <w:trPr>
-          <w:cantSplit w:val="0"/>
-          <w:tblHeader w:val="0"/>
-        </w:trPr>
-        <w:tc>
-          <w:tcPr/>
-          <w:p ns1:paraId="0000004F">
-            <w:pPr>
-              <w:rPr/>
-            </w:pPr>
-            <w:r>
-              <w:rPr>
-                <w:rtl w:val="0"/>
-              </w:rPr>
-              <w:t xml:space="preserve">usuarios</w:t>
-            </w:r>
-          </w:p>
-        </w:tc>
-        <w:tc>
-          <w:tcPr/>
-          <w:p ns1:paraId="00000050">
-            <w:pPr>
-              <w:rPr/>
-            </w:pPr>
-            <w:r>
-              <w:rPr>
-                <w:rtl w:val="0"/>
-              </w:rPr>
-              <w:t xml:space="preserve">version, created_at, updated_at, deleted_at</w:t>
-            </w:r>
-          </w:p>
-        </w:tc>
-        <w:tc>
-          <w:tcPr/>
-          <w:p ns1:paraId="00000051">
-            <w:pPr>
-              <w:rPr/>
-            </w:pPr>
-            <w:r>
-              <w:rPr>
-                <w:rtl w:val="0"/>
-              </w:rPr>
-              <w:t xml:space="preserve">Control de versión y marcas de tiempo (deleted_at controla si la cuenta está activa o inactiva)</w:t>
-            </w:r>
-          </w:p>
-        </w:tc>
-      </w:tr>
-      <w:tr>
-        <w:trPr>
-          <w:cantSplit w:val="0"/>
-          <w:tblHeader w:val="0"/>
-        </w:trPr>
-        <w:tc>
-          <w:tcPr/>
-          <w:p ns1:paraId="0000004F">
+          <w:p>
+            <w:pPr>
+              <w:rPr/>
+            </w:pPr>
+            <w:r>
+              <w:rPr>
+                <w:rtl w:val="0"/>
+              </w:rPr>
+              <w:t xml:space="preserve">deleted_at</w:t>
+            </w:r>
+          </w:p>
+        </w:tc>
+        <w:tc>
+          <w:tcPr/>
+          <w:p>
+            <w:pPr>
+              <w:rPr/>
+            </w:pPr>
+            <w:r>
+              <w:rPr>
+                <w:rtl w:val="0"/>
+              </w:rPr>
+              <w:t xml:space="preserve">Marca de tiempo de desactivación de cuenta / borrado lógico</w:t>
+            </w:r>
+          </w:p>
+        </w:tc>
+      </w:tr>
+      <w:tr>
+        <w:trPr>
+          <w:cantSplit w:val="0"/>
+          <w:tblHeader w:val="0"/>
+        </w:trPr>
+        <w:tc>
+          <w:tcPr/>
+          <w:p>
             <w:pPr>
               <w:rPr/>
             </w:pPr>
@@ -2000,7 +2048,343 @@
         </w:tc>
         <w:tc>
           <w:tcPr/>
-          <w:p ns1:paraId="00000050">
+          <w:p>
+            <w:pPr>
+              <w:rPr/>
+            </w:pPr>
+            <w:r>
+              <w:rPr>
+                <w:rtl w:val="0"/>
+              </w:rPr>
+              <w:t xml:space="preserve">id / uuid</w:t>
+            </w:r>
+          </w:p>
+        </w:tc>
+        <w:tc>
+          <w:tcPr/>
+          <w:p>
+            <w:pPr>
+              <w:rPr/>
+            </w:pPr>
+            <w:r>
+              <w:rPr>
+                <w:rtl w:val="0"/>
+              </w:rPr>
+              <w:t xml:space="preserve">Identificador local y global</w:t>
+            </w:r>
+          </w:p>
+        </w:tc>
+      </w:tr>
+      <w:tr>
+        <w:trPr>
+          <w:cantSplit w:val="0"/>
+          <w:tblHeader w:val="0"/>
+        </w:trPr>
+        <w:tc>
+          <w:tcPr/>
+          <w:p>
+            <w:pPr>
+              <w:rPr/>
+            </w:pPr>
+            <w:r>
+              <w:rPr>
+                <w:rtl w:val="0"/>
+              </w:rPr>
+              <w:t xml:space="preserve">ciudadanos</w:t>
+            </w:r>
+          </w:p>
+        </w:tc>
+        <w:tc>
+          <w:tcPr/>
+          <w:p>
+            <w:pPr>
+              <w:rPr/>
+            </w:pPr>
+            <w:r>
+              <w:rPr>
+                <w:rtl w:val="0"/>
+              </w:rPr>
+              <w:t xml:space="preserve">usuario_id</w:t>
+            </w:r>
+          </w:p>
+        </w:tc>
+        <w:tc>
+          <w:tcPr/>
+          <w:p>
+            <w:pPr>
+              <w:rPr/>
+            </w:pPr>
+            <w:r>
+              <w:rPr>
+                <w:rtl w:val="0"/>
+              </w:rPr>
+              <w:t xml:space="preserve">Operador que registró el ciudadano</w:t>
+            </w:r>
+          </w:p>
+        </w:tc>
+      </w:tr>
+      <w:tr>
+        <w:trPr>
+          <w:cantSplit w:val="0"/>
+          <w:tblHeader w:val="0"/>
+        </w:trPr>
+        <w:tc>
+          <w:tcPr/>
+          <w:p>
+            <w:pPr>
+              <w:rPr/>
+            </w:pPr>
+            <w:r>
+              <w:rPr>
+                <w:rtl w:val="0"/>
+              </w:rPr>
+              <w:t xml:space="preserve">ciudadanos</w:t>
+            </w:r>
+          </w:p>
+        </w:tc>
+        <w:tc>
+          <w:tcPr/>
+          <w:p>
+            <w:pPr>
+              <w:rPr/>
+            </w:pPr>
+            <w:r>
+              <w:rPr>
+                <w:rtl w:val="0"/>
+              </w:rPr>
+              <w:t xml:space="preserve">documento_identidad</w:t>
+            </w:r>
+          </w:p>
+        </w:tc>
+        <w:tc>
+          <w:tcPr/>
+          <w:p>
+            <w:pPr>
+              <w:rPr/>
+            </w:pPr>
+            <w:r>
+              <w:rPr>
+                <w:rtl w:val="0"/>
+              </w:rPr>
+              <w:t xml:space="preserve">Documento de identidad de 6 a 12 dígitos (único en servidor)</w:t>
+            </w:r>
+          </w:p>
+        </w:tc>
+      </w:tr>
+      <w:tr>
+        <w:trPr>
+          <w:cantSplit w:val="0"/>
+          <w:tblHeader w:val="0"/>
+        </w:trPr>
+        <w:tc>
+          <w:tcPr/>
+          <w:p>
+            <w:pPr>
+              <w:rPr/>
+            </w:pPr>
+            <w:r>
+              <w:rPr>
+                <w:rtl w:val="0"/>
+              </w:rPr>
+              <w:t xml:space="preserve">ciudadanos</w:t>
+            </w:r>
+          </w:p>
+        </w:tc>
+        <w:tc>
+          <w:tcPr/>
+          <w:p>
+            <w:pPr>
+              <w:rPr/>
+            </w:pPr>
+            <w:r>
+              <w:rPr>
+                <w:rtl w:val="0"/>
+              </w:rPr>
+              <w:t xml:space="preserve">nombres, apellidos, created_at_nacimiento, telefono, correo, metadatos_campos</w:t>
+            </w:r>
+          </w:p>
+        </w:tc>
+        <w:tc>
+          <w:tcPr/>
+          <w:p>
+            <w:pPr>
+              <w:rPr/>
+            </w:pPr>
+            <w:r>
+              <w:rPr>
+                <w:rtl w:val="0"/>
+              </w:rPr>
+              <w:t xml:space="preserve">Datos personales (sin restricción de mayoría de edad +18) y metadatos_campos JSON para LWW</w:t>
+            </w:r>
+          </w:p>
+        </w:tc>
+      </w:tr>
+      <w:tr>
+        <w:trPr>
+          <w:cantSplit w:val="0"/>
+          <w:tblHeader w:val="0"/>
+        </w:trPr>
+        <w:tc>
+          <w:tcPr/>
+          <w:p>
+            <w:pPr>
+              <w:rPr/>
+            </w:pPr>
+            <w:r>
+              <w:rPr>
+                <w:rtl w:val="0"/>
+              </w:rPr>
+              <w:t xml:space="preserve">ciudadanos</w:t>
+            </w:r>
+          </w:p>
+        </w:tc>
+        <w:tc>
+          <w:tcPr/>
+          <w:p>
+            <w:pPr>
+              <w:rPr/>
+            </w:pPr>
+            <w:r>
+              <w:rPr>
+                <w:rtl w:val="0"/>
+              </w:rPr>
+              <w:t xml:space="preserve">deleted_at / deleted</w:t>
+            </w:r>
+          </w:p>
+        </w:tc>
+        <w:tc>
+          <w:tcPr/>
+          <w:p>
+            <w:pPr>
+              <w:rPr/>
+            </w:pPr>
+            <w:r>
+              <w:rPr>
+                <w:rtl w:val="0"/>
+              </w:rPr>
+              <w:t xml:space="preserve">Estado del registro y borrado lógico</w:t>
+            </w:r>
+          </w:p>
+        </w:tc>
+      </w:tr>
+      <w:tr>
+        <w:trPr>
+          <w:cantSplit w:val="0"/>
+          <w:tblHeader w:val="0"/>
+        </w:trPr>
+        <w:tc>
+          <w:tcPr/>
+          <w:p>
+            <w:pPr>
+              <w:rPr/>
+            </w:pPr>
+            <w:r>
+              <w:rPr>
+                <w:rtl w:val="0"/>
+              </w:rPr>
+              <w:t xml:space="preserve">ciudadanos</w:t>
+            </w:r>
+          </w:p>
+        </w:tc>
+        <w:tc>
+          <w:tcPr/>
+          <w:p>
+            <w:pPr>
+              <w:rPr/>
+            </w:pPr>
+            <w:r>
+              <w:rPr>
+                <w:rtl w:val="0"/>
+              </w:rPr>
+              <w:t xml:space="preserve">estado_sincronizacion</w:t>
+            </w:r>
+          </w:p>
+        </w:tc>
+        <w:tc>
+          <w:tcPr/>
+          <w:p>
+            <w:pPr>
+              <w:rPr/>
+            </w:pPr>
+            <w:r>
+              <w:rPr>
+                <w:rtl w:val="0"/>
+              </w:rPr>
+              <w:t xml:space="preserve">PENDIENTE / SINCRONIZADO / CONFLICTO</w:t>
+            </w:r>
+          </w:p>
+        </w:tc>
+      </w:tr>
+      <w:tr>
+        <w:trPr>
+          <w:cantSplit w:val="0"/>
+          <w:tblHeader w:val="0"/>
+        </w:trPr>
+        <w:tc>
+          <w:tcPr/>
+          <w:p>
+            <w:pPr>
+              <w:rPr/>
+            </w:pPr>
+            <w:r>
+              <w:rPr>
+                <w:rtl w:val="0"/>
+              </w:rPr>
+              <w:t xml:space="preserve">ciudadanos</w:t>
+            </w:r>
+          </w:p>
+        </w:tc>
+        <w:tc>
+          <w:tcPr/>
+          <w:p>
+            <w:pPr>
+              <w:rPr/>
+            </w:pPr>
+            <w:r>
+              <w:rPr>
+                <w:rtl w:val="0"/>
+              </w:rPr>
+              <w:t xml:space="preserve">version</w:t>
+            </w:r>
+          </w:p>
+        </w:tc>
+        <w:tc>
+          <w:tcPr/>
+          <w:p>
+            <w:pPr>
+              <w:rPr/>
+            </w:pPr>
+            <w:r>
+              <w:rPr>
+                <w:rtl w:val="0"/>
+              </w:rPr>
+              <w:t xml:space="preserve">Contador de ediciones, usado para detectar conflictos</w:t>
+            </w:r>
+          </w:p>
+        </w:tc>
+      </w:tr>
+      <w:tr>
+        <w:trPr>
+          <w:cantSplit w:val="0"/>
+          <w:tblHeader w:val="0"/>
+        </w:trPr>
+        <w:tc>
+          <w:tcPr/>
+          <w:p>
+            <w:pPr>
+              <w:rPr/>
+            </w:pPr>
+            <w:r>
+              <w:rPr>
+                <w:rtl w:val="0"/>
+              </w:rPr>
+              <w:t xml:space="preserve">sync_queue</w:t>
+            </w:r>
+          </w:p>
+        </w:tc>
+        <w:tc>
+          <w:tcPr/>
+          <w:p>
             <w:pPr>
               <w:rPr/>
             </w:pPr>
@@ -2014,411 +2398,27 @@
         </w:tc>
         <w:tc>
           <w:tcPr/>
-          <w:p ns1:paraId="00000051">
-            <w:pPr>
-              <w:rPr/>
-            </w:pPr>
-            <w:r>
-              <w:rPr>
-                <w:rtl w:val="0"/>
-              </w:rPr>
-              <w:t xml:space="preserve">UUID identificador único global</w:t>
-            </w:r>
-          </w:p>
-        </w:tc>
-      </w:tr>
-      <w:tr>
-        <w:trPr>
-          <w:cantSplit w:val="0"/>
-          <w:tblHeader w:val="0"/>
-        </w:trPr>
-        <w:tc>
-          <w:tcPr/>
-          <w:p ns1:paraId="0000004F">
-            <w:pPr>
-              <w:rPr/>
-            </w:pPr>
-            <w:r>
-              <w:rPr>
-                <w:rtl w:val="0"/>
-              </w:rPr>
-              <w:t xml:space="preserve">ciudadanos</w:t>
-            </w:r>
-          </w:p>
-        </w:tc>
-        <w:tc>
-          <w:tcPr/>
-          <w:p ns1:paraId="00000050">
-            <w:pPr>
-              <w:rPr/>
-            </w:pPr>
-            <w:r>
-              <w:rPr>
-                <w:rtl w:val="0"/>
-              </w:rPr>
-              <w:t xml:space="preserve">documento_identidad</w:t>
-            </w:r>
-          </w:p>
-        </w:tc>
-        <w:tc>
-          <w:tcPr/>
-          <w:p ns1:paraId="00000051">
-            <w:pPr>
-              <w:rPr/>
-            </w:pPr>
-            <w:r>
-              <w:rPr>
-                <w:rtl w:val="0"/>
-              </w:rPr>
-              <w:t xml:space="preserve">Documento de identidad (6 a 12 dígitos, único en servidor)</w:t>
-            </w:r>
-          </w:p>
-        </w:tc>
-      </w:tr>
-      <w:tr>
-        <w:trPr>
-          <w:cantSplit w:val="0"/>
-          <w:tblHeader w:val="0"/>
-        </w:trPr>
-        <w:tc>
-          <w:tcPr/>
-          <w:p ns1:paraId="0000004F">
-            <w:pPr>
-              <w:rPr/>
-            </w:pPr>
-            <w:r>
-              <w:rPr>
-                <w:rtl w:val="0"/>
-              </w:rPr>
-              <w:t xml:space="preserve">ciudadanos</w:t>
-            </w:r>
-          </w:p>
-        </w:tc>
-        <w:tc>
-          <w:tcPr/>
-          <w:p ns1:paraId="00000050">
-            <w:pPr>
-              <w:rPr/>
-            </w:pPr>
-            <w:r>
-              <w:rPr>
-                <w:rtl w:val="0"/>
-              </w:rPr>
-              <w:t xml:space="preserve">nombres, apellidos, fecha_nacimiento</w:t>
-            </w:r>
-          </w:p>
-        </w:tc>
-        <w:tc>
-          <w:tcPr/>
-          <w:p ns1:paraId="00000051">
-            <w:pPr>
-              <w:rPr/>
-            </w:pPr>
-            <w:r>
-              <w:rPr>
-                <w:rtl w:val="0"/>
-              </w:rPr>
-              <w:t xml:space="preserve">Datos personales (fecha_nacimiento no requiere mayoría de edad +18)</w:t>
-            </w:r>
-          </w:p>
-        </w:tc>
-      </w:tr>
-      <w:tr>
-        <w:trPr>
-          <w:cantSplit w:val="0"/>
-          <w:tblHeader w:val="0"/>
-        </w:trPr>
-        <w:tc>
-          <w:tcPr/>
-          <w:p ns1:paraId="0000004F">
-            <w:pPr>
-              <w:rPr/>
-            </w:pPr>
-            <w:r>
-              <w:rPr>
-                <w:rtl w:val="0"/>
-              </w:rPr>
-              <w:t xml:space="preserve">ciudadanos</w:t>
-            </w:r>
-          </w:p>
-        </w:tc>
-        <w:tc>
-          <w:tcPr/>
-          <w:p ns1:paraId="00000050">
-            <w:pPr>
-              <w:rPr/>
-            </w:pPr>
-            <w:r>
-              <w:rPr>
-                <w:rtl w:val="0"/>
-              </w:rPr>
-              <w:t xml:space="preserve">telefono, correo</w:t>
-            </w:r>
-          </w:p>
-        </w:tc>
-        <w:tc>
-          <w:tcPr/>
-          <w:p ns1:paraId="00000051">
-            <w:pPr>
-              <w:rPr/>
-            </w:pPr>
-            <w:r>
-              <w:rPr>
-                <w:rtl w:val="0"/>
-              </w:rPr>
-              <w:t xml:space="preserve">Datos de contacto (opcionales)</w:t>
-            </w:r>
-          </w:p>
-        </w:tc>
-      </w:tr>
-      <w:tr>
-        <w:trPr>
-          <w:cantSplit w:val="0"/>
-          <w:tblHeader w:val="0"/>
-        </w:trPr>
-        <w:tc>
-          <w:tcPr/>
-          <w:p ns1:paraId="0000004F">
-            <w:pPr>
-              <w:rPr/>
-            </w:pPr>
-            <w:r>
-              <w:rPr>
-                <w:rtl w:val="0"/>
-              </w:rPr>
-              <w:t xml:space="preserve">ciudadanos</w:t>
-            </w:r>
-          </w:p>
-        </w:tc>
-        <w:tc>
-          <w:tcPr/>
-          <w:p ns1:paraId="00000050">
-            <w:pPr>
-              <w:rPr/>
-            </w:pPr>
-            <w:r>
-              <w:rPr>
-                <w:rtl w:val="0"/>
-              </w:rPr>
-              <w:t xml:space="preserve">estado_sincronizacion</w:t>
-            </w:r>
-          </w:p>
-        </w:tc>
-        <w:tc>
-          <w:tcPr/>
-          <w:p ns1:paraId="00000051">
-            <w:pPr>
-              <w:rPr/>
-            </w:pPr>
-            <w:r>
-              <w:rPr>
-                <w:rtl w:val="0"/>
-              </w:rPr>
-              <w:t xml:space="preserve">Estado local de sincronización (PENDIENTE / SINCRONIZADO / CONFLICTO)</w:t>
-            </w:r>
-          </w:p>
-        </w:tc>
-      </w:tr>
-      <w:tr>
-        <w:trPr>
-          <w:cantSplit w:val="0"/>
-          <w:tblHeader w:val="0"/>
-        </w:trPr>
-        <w:tc>
-          <w:tcPr/>
-          <w:p ns1:paraId="0000004F">
-            <w:pPr>
-              <w:rPr/>
-            </w:pPr>
-            <w:r>
-              <w:rPr>
-                <w:rtl w:val="0"/>
-              </w:rPr>
-              <w:t xml:space="preserve">ciudadanos</w:t>
-            </w:r>
-          </w:p>
-        </w:tc>
-        <w:tc>
-          <w:tcPr/>
-          <w:p ns1:paraId="00000050">
-            <w:pPr>
-              <w:rPr/>
-            </w:pPr>
-            <w:r>
-              <w:rPr>
-                <w:rtl w:val="0"/>
-              </w:rPr>
-              <w:t xml:space="preserve">registrado_por_usuario_id</w:t>
-            </w:r>
-          </w:p>
-        </w:tc>
-        <w:tc>
-          <w:tcPr/>
-          <w:p ns1:paraId="00000051">
-            <w:pPr>
-              <w:rPr/>
-            </w:pPr>
-            <w:r>
-              <w:rPr>
-                <w:rtl w:val="0"/>
-              </w:rPr>
-              <w:t xml:space="preserve">FK al usuario registrador en sesión</w:t>
-            </w:r>
-          </w:p>
-        </w:tc>
-      </w:tr>
-      <w:tr>
-        <w:trPr>
-          <w:cantSplit w:val="0"/>
-          <w:tblHeader w:val="0"/>
-        </w:trPr>
-        <w:tc>
-          <w:tcPr/>
-          <w:p ns1:paraId="0000004F">
-            <w:pPr>
-              <w:rPr/>
-            </w:pPr>
-            <w:r>
-              <w:rPr>
-                <w:rtl w:val="0"/>
-              </w:rPr>
-              <w:t xml:space="preserve">ciudadanos</w:t>
-            </w:r>
-          </w:p>
-        </w:tc>
-        <w:tc>
-          <w:tcPr/>
-          <w:p ns1:paraId="00000050">
-            <w:pPr>
-              <w:rPr/>
-            </w:pPr>
-            <w:r>
-              <w:rPr>
-                <w:rtl w:val="0"/>
-              </w:rPr>
-              <w:t xml:space="preserve">registrado_en_dispositivo_id</w:t>
-            </w:r>
-          </w:p>
-        </w:tc>
-        <w:tc>
-          <w:tcPr/>
-          <w:p ns1:paraId="00000051">
-            <w:pPr>
-              <w:rPr/>
-            </w:pPr>
-            <w:r>
-              <w:rPr>
-                <w:rtl w:val="0"/>
-              </w:rPr>
-              <w:t xml:space="preserve">FK al dispositivo originador del registro</w:t>
-            </w:r>
-          </w:p>
-        </w:tc>
-      </w:tr>
-      <w:tr>
-        <w:trPr>
-          <w:cantSplit w:val="0"/>
-          <w:tblHeader w:val="0"/>
-        </w:trPr>
-        <w:tc>
-          <w:tcPr/>
-          <w:p ns1:paraId="0000004F">
-            <w:pPr>
-              <w:rPr/>
-            </w:pPr>
-            <w:r>
-              <w:rPr>
-                <w:rtl w:val="0"/>
-              </w:rPr>
-              <w:t xml:space="preserve">ciudadanos</w:t>
-            </w:r>
-          </w:p>
-        </w:tc>
-        <w:tc>
-          <w:tcPr/>
-          <w:p ns1:paraId="00000050">
-            <w:pPr>
-              <w:rPr/>
-            </w:pPr>
-            <w:r>
-              <w:rPr>
-                <w:rtl w:val="0"/>
-              </w:rPr>
-              <w:t xml:space="preserve">metadatos_campos</w:t>
-            </w:r>
-          </w:p>
-        </w:tc>
-        <w:tc>
-          <w:tcPr/>
-          <w:p ns1:paraId="00000051">
-            <w:pPr>
-              <w:rPr/>
-            </w:pPr>
-            <w:r>
-              <w:rPr>
-                <w:rtl w:val="0"/>
-              </w:rPr>
-              <w:t xml:space="preserve">Objeto JSON con timestamps ISO individuales por campo para resolución de conflictos LWW</w:t>
-            </w:r>
-          </w:p>
-        </w:tc>
-      </w:tr>
-      <w:tr>
-        <w:trPr>
-          <w:cantSplit w:val="0"/>
-          <w:tblHeader w:val="0"/>
-        </w:trPr>
-        <w:tc>
-          <w:tcPr/>
-          <w:p ns1:paraId="0000004F">
-            <w:pPr>
-              <w:rPr/>
-            </w:pPr>
-            <w:r>
-              <w:rPr>
-                <w:rtl w:val="0"/>
-              </w:rPr>
-              <w:t xml:space="preserve">ciudadanos</w:t>
-            </w:r>
-          </w:p>
-        </w:tc>
-        <w:tc>
-          <w:tcPr/>
-          <w:p ns1:paraId="00000050">
-            <w:pPr>
-              <w:rPr/>
-            </w:pPr>
-            <w:r>
-              <w:rPr>
-                <w:rtl w:val="0"/>
-              </w:rPr>
-              <w:t xml:space="preserve">version, created_at, updated_at, deleted_at</w:t>
-            </w:r>
-          </w:p>
-        </w:tc>
-        <w:tc>
-          <w:tcPr/>
-          <w:p ns1:paraId="00000051">
-            <w:pPr>
-              <w:rPr/>
-            </w:pPr>
-            <w:r>
-              <w:rPr>
-                <w:rtl w:val="0"/>
-              </w:rPr>
-              <w:t xml:space="preserve">Versión, marcas de tiempo y borrado lógico</w:t>
-            </w:r>
-          </w:p>
-        </w:tc>
-      </w:tr>
-      <w:tr>
-        <w:trPr>
-          <w:cantSplit w:val="0"/>
-          <w:tblHeader w:val="0"/>
-        </w:trPr>
-        <w:tc>
-          <w:tcPr/>
-          <w:p ns1:paraId="0000004F">
+          <w:p>
+            <w:pPr>
+              <w:rPr/>
+            </w:pPr>
+            <w:r>
+              <w:rPr>
+                <w:rtl w:val="0"/>
+              </w:rPr>
+              <w:t xml:space="preserve">Identificador local</w:t>
+            </w:r>
+          </w:p>
+        </w:tc>
+      </w:tr>
+      <w:tr>
+        <w:trPr>
+          <w:cantSplit w:val="0"/>
+          <w:tblHeader w:val="0"/>
+        </w:trPr>
+        <w:tc>
+          <w:tcPr/>
+          <w:p>
             <w:pPr>
               <w:rPr/>
             </w:pPr>
@@ -2432,41 +2432,41 @@
         </w:tc>
         <w:tc>
           <w:tcPr/>
-          <w:p ns1:paraId="00000050">
-            <w:pPr>
-              <w:rPr/>
-            </w:pPr>
-            <w:r>
-              <w:rPr>
-                <w:rtl w:val="0"/>
-              </w:rPr>
-              <w:t xml:space="preserve">id</w:t>
-            </w:r>
-          </w:p>
-        </w:tc>
-        <w:tc>
-          <w:tcPr/>
-          <w:p ns1:paraId="00000051">
-            <w:pPr>
-              <w:rPr/>
-            </w:pPr>
-            <w:r>
-              <w:rPr>
-                <w:rtl w:val="0"/>
-              </w:rPr>
-              <w:t xml:space="preserve">UUID único de la tarea en la cola de salida</w:t>
-            </w:r>
-          </w:p>
-        </w:tc>
-      </w:tr>
-      <w:tr>
-        <w:trPr>
-          <w:cantSplit w:val="0"/>
-          <w:tblHeader w:val="0"/>
-        </w:trPr>
-        <w:tc>
-          <w:tcPr/>
-          <w:p ns1:paraId="0000004F">
+          <w:p>
+            <w:pPr>
+              <w:rPr/>
+            </w:pPr>
+            <w:r>
+              <w:rPr>
+                <w:rtl w:val="0"/>
+              </w:rPr>
+              <w:t xml:space="preserve">tabla_afectada / registro_id / operacion</w:t>
+            </w:r>
+          </w:p>
+        </w:tc>
+        <w:tc>
+          <w:tcPr/>
+          <w:p>
+            <w:pPr>
+              <w:rPr/>
+            </w:pPr>
+            <w:r>
+              <w:rPr>
+                <w:rtl w:val="0"/>
+              </w:rPr>
+              <w:t xml:space="preserve">Tabla objeto del cambio, UUID del registro y operación (INSERT/UPDATE/DELETE)</w:t>
+            </w:r>
+          </w:p>
+        </w:tc>
+      </w:tr>
+      <w:tr>
+        <w:trPr>
+          <w:cantSplit w:val="0"/>
+          <w:tblHeader w:val="0"/>
+        </w:trPr>
+        <w:tc>
+          <w:tcPr/>
+          <w:p>
             <w:pPr>
               <w:rPr/>
             </w:pPr>
@@ -2480,41 +2480,41 @@
         </w:tc>
         <w:tc>
           <w:tcPr/>
-          <w:p ns1:paraId="00000050">
-            <w:pPr>
-              <w:rPr/>
-            </w:pPr>
-            <w:r>
-              <w:rPr>
-                <w:rtl w:val="0"/>
-              </w:rPr>
-              <w:t xml:space="preserve">tabla_afectada, registro_id, operacion</w:t>
-            </w:r>
-          </w:p>
-        </w:tc>
-        <w:tc>
-          <w:tcPr/>
-          <w:p ns1:paraId="00000051">
-            <w:pPr>
-              <w:rPr/>
-            </w:pPr>
-            <w:r>
-              <w:rPr>
-                <w:rtl w:val="0"/>
-              </w:rPr>
-              <w:t xml:space="preserve">Tabla objeto del cambio, UUID del registro afectado y operación (INSERT/UPDATE/DELETE)</w:t>
-            </w:r>
-          </w:p>
-        </w:tc>
-      </w:tr>
-      <w:tr>
-        <w:trPr>
-          <w:cantSplit w:val="0"/>
-          <w:tblHeader w:val="0"/>
-        </w:trPr>
-        <w:tc>
-          <w:tcPr/>
-          <w:p ns1:paraId="0000004F">
+          <w:p>
+            <w:pPr>
+              <w:rPr/>
+            </w:pPr>
+            <w:r>
+              <w:rPr>
+                <w:rtl w:val="0"/>
+              </w:rPr>
+              <w:t xml:space="preserve">payload</w:t>
+            </w:r>
+          </w:p>
+        </w:tc>
+        <w:tc>
+          <w:tcPr/>
+          <w:p>
+            <w:pPr>
+              <w:rPr/>
+            </w:pPr>
+            <w:r>
+              <w:rPr>
+                <w:rtl w:val="0"/>
+              </w:rPr>
+              <w:t xml:space="preserve">Snapshot JSON del registro en el momento del cambio (no se relee de la tabla)</w:t>
+            </w:r>
+          </w:p>
+        </w:tc>
+      </w:tr>
+      <w:tr>
+        <w:trPr>
+          <w:cantSplit w:val="0"/>
+          <w:tblHeader w:val="0"/>
+        </w:trPr>
+        <w:tc>
+          <w:tcPr/>
+          <w:p>
             <w:pPr>
               <w:rPr/>
             </w:pPr>
@@ -2528,41 +2528,41 @@
         </w:tc>
         <w:tc>
           <w:tcPr/>
-          <w:p ns1:paraId="00000050">
-            <w:pPr>
-              <w:rPr/>
-            </w:pPr>
-            <w:r>
-              <w:rPr>
-                <w:rtl w:val="0"/>
-              </w:rPr>
-              <w:t xml:space="preserve">payload</w:t>
-            </w:r>
-          </w:p>
-        </w:tc>
-        <w:tc>
-          <w:tcPr/>
-          <w:p ns1:paraId="00000051">
-            <w:pPr>
-              <w:rPr/>
-            </w:pPr>
-            <w:r>
-              <w:rPr>
-                <w:rtl w:val="0"/>
-              </w:rPr>
-              <w:t xml:space="preserve">Snapshot JSON del registro en el momento de la mutación</w:t>
-            </w:r>
-          </w:p>
-        </w:tc>
-      </w:tr>
-      <w:tr>
-        <w:trPr>
-          <w:cantSplit w:val="0"/>
-          <w:tblHeader w:val="0"/>
-        </w:trPr>
-        <w:tc>
-          <w:tcPr/>
-          <w:p ns1:paraId="0000004F">
+          <w:p>
+            <w:pPr>
+              <w:rPr/>
+            </w:pPr>
+            <w:r>
+              <w:rPr>
+                <w:rtl w:val="0"/>
+              </w:rPr>
+              <w:t xml:space="preserve">deleted_at</w:t>
+            </w:r>
+          </w:p>
+        </w:tc>
+        <w:tc>
+          <w:tcPr/>
+          <w:p>
+            <w:pPr>
+              <w:rPr/>
+            </w:pPr>
+            <w:r>
+              <w:rPr>
+                <w:rtl w:val="0"/>
+              </w:rPr>
+              <w:t xml:space="preserve">PENDIENTE / PROCESANDO / ERROR — controla reintentos e intentos</w:t>
+            </w:r>
+          </w:p>
+        </w:tc>
+      </w:tr>
+      <w:tr>
+        <w:trPr>
+          <w:cantSplit w:val="0"/>
+          <w:tblHeader w:val="0"/>
+        </w:trPr>
+        <w:tc>
+          <w:tcPr/>
+          <w:p>
             <w:pPr>
               <w:rPr/>
             </w:pPr>
@@ -2576,55 +2576,7 @@
         </w:tc>
         <w:tc>
           <w:tcPr/>
-          <w:p ns1:paraId="00000050">
-            <w:pPr>
-              <w:rPr/>
-            </w:pPr>
-            <w:r>
-              <w:rPr>
-                <w:rtl w:val="0"/>
-              </w:rPr>
-              <w:t xml:space="preserve">estado, intentos, ultimo_error</w:t>
-            </w:r>
-          </w:p>
-        </w:tc>
-        <w:tc>
-          <w:tcPr/>
-          <w:p ns1:paraId="00000051">
-            <w:pPr>
-              <w:rPr/>
-            </w:pPr>
-            <w:r>
-              <w:rPr>
-                <w:rtl w:val="0"/>
-              </w:rPr>
-              <w:t xml:space="preserve">Estado (PENDIENTE/PROCESANDO/ERROR), reintentos y último error retornado por la red</w:t>
-            </w:r>
-          </w:p>
-        </w:tc>
-      </w:tr>
-      <w:tr>
-        <w:trPr>
-          <w:cantSplit w:val="0"/>
-          <w:tblHeader w:val="0"/>
-        </w:trPr>
-        <w:tc>
-          <w:tcPr/>
-          <w:p ns1:paraId="0000004F">
-            <w:pPr>
-              <w:rPr/>
-            </w:pPr>
-            <w:r>
-              <w:rPr>
-                <w:rtl w:val="0"/>
-              </w:rPr>
-              <w:t xml:space="preserve">sync_queue</w:t>
-            </w:r>
-          </w:p>
-        </w:tc>
-        <w:tc>
-          <w:tcPr/>
-          <w:p ns1:paraId="00000050">
+          <w:p>
             <w:pPr>
               <w:rPr/>
             </w:pPr>
@@ -2638,21 +2590,21 @@
         </w:tc>
         <w:tc>
           <w:tcPr/>
-          <w:p ns1:paraId="00000051">
-            <w:pPr>
-              <w:rPr/>
-            </w:pPr>
-            <w:r>
-              <w:rPr>
-                <w:rtl w:val="0"/>
-              </w:rPr>
-              <w:t xml:space="preserve">Marca de tiempo del evento para orden e idempotencia</w:t>
+          <w:p>
+            <w:pPr>
+              <w:rPr/>
+            </w:pPr>
+            <w:r>
+              <w:rPr>
+                <w:rtl w:val="0"/>
+              </w:rPr>
+              <w:t xml:space="preserve">Timestamp del cambio, usado para idempotencia</w:t>
             </w:r>
           </w:p>
         </w:tc>
       </w:tr>
     </w:tbl>
-    <w:p ns1:paraId="0000008B">
+    <w:p>
       <w:pPr>
         <w:pStyle w:val="Heading2"/>
         <w:rPr/>
@@ -2699,7 +2651,7 @@
           <w:tcPr>
             <w:shd w:fill="2c5f8a" w:val="clear"/>
           </w:tcPr>
-          <w:p ns1:paraId="0000008C">
+          <w:p>
             <w:pPr>
               <w:rPr/>
             </w:pPr>
@@ -2721,7 +2673,7 @@
           <w:tcPr>
             <w:shd w:fill="2c5f8a" w:val="clear"/>
           </w:tcPr>
-          <w:p ns1:paraId="0000008D">
+          <w:p>
             <w:pPr>
               <w:rPr/>
             </w:pPr>
@@ -2747,7 +2699,7 @@
         </w:trPr>
         <w:tc>
           <w:tcPr/>
-          <w:p ns1:paraId="0000008E">
+          <w:p>
             <w:pPr>
               <w:rPr/>
             </w:pPr>
@@ -2761,27 +2713,27 @@
         </w:tc>
         <w:tc>
           <w:tcPr/>
-          <w:p ns1:paraId="0000008F">
-            <w:pPr>
-              <w:rPr/>
-            </w:pPr>
-            <w:r>
-              <w:rPr>
-                <w:rtl w:val="0"/>
-              </w:rPr>
-              <w:t xml:space="preserve">Fuente de verdad de credenciales, rol (ADMIN/REGISTRADOR), borrado lógico (deleted_at) y dispositivo activo vinculado (dispositivo_activo_id)</w:t>
-            </w:r>
-          </w:p>
-        </w:tc>
-      </w:tr>
-      <w:tr>
-        <w:trPr>
-          <w:cantSplit w:val="0"/>
-          <w:tblHeader w:val="0"/>
-        </w:trPr>
-        <w:tc>
-          <w:tcPr/>
-          <w:p ns1:paraId="0000008E">
+          <w:p>
+            <w:pPr>
+              <w:rPr/>
+            </w:pPr>
+            <w:r>
+              <w:rPr>
+                <w:rtl w:val="0"/>
+              </w:rPr>
+              <w:t xml:space="preserve">Fuente de verdad de credenciales y deleted_at de cuenta</w:t>
+            </w:r>
+          </w:p>
+        </w:tc>
+      </w:tr>
+      <w:tr>
+        <w:trPr>
+          <w:cantSplit w:val="0"/>
+          <w:tblHeader w:val="0"/>
+        </w:trPr>
+        <w:tc>
+          <w:tcPr/>
+          <w:p>
             <w:pPr>
               <w:rPr/>
             </w:pPr>
@@ -2795,7 +2747,7 @@
         </w:tc>
         <w:tc>
           <w:tcPr/>
-          <w:p ns1:paraId="0000008F">
+          <w:p>
             <w:pPr>
               <w:rPr/>
             </w:pPr>
@@ -2815,7 +2767,7 @@
         </w:trPr>
         <w:tc>
           <w:tcPr/>
-          <w:p ns1:paraId="0000008E">
+          <w:p>
             <w:pPr>
               <w:rPr/>
             </w:pPr>
@@ -2829,27 +2781,27 @@
         </w:tc>
         <w:tc>
           <w:tcPr/>
-          <w:p ns1:paraId="0000008F">
-            <w:pPr>
-              <w:rPr/>
-            </w:pPr>
-            <w:r>
-              <w:rPr>
-                <w:rtl w:val="0"/>
-              </w:rPr>
-              <w:t xml:space="preserve">Controla el código único (codigo_unico), nombre, modelo y SO del dispositivo activo por usuario</w:t>
-            </w:r>
-          </w:p>
-        </w:tc>
-      </w:tr>
-      <w:tr>
-        <w:trPr>
-          <w:cantSplit w:val="0"/>
-          <w:tblHeader w:val="0"/>
-        </w:trPr>
-        <w:tc>
-          <w:tcPr/>
-          <w:p ns1:paraId="0000008E">
+          <w:p>
+            <w:pPr>
+              <w:rPr/>
+            </w:pPr>
+            <w:r>
+              <w:rPr>
+                <w:rtl w:val="0"/>
+              </w:rPr>
+              <w:t xml:space="preserve">Nueva tabla: controla cuál rol está activo por usuario</w:t>
+            </w:r>
+          </w:p>
+        </w:tc>
+      </w:tr>
+      <w:tr>
+        <w:trPr>
+          <w:cantSplit w:val="0"/>
+          <w:tblHeader w:val="0"/>
+        </w:trPr>
+        <w:tc>
+          <w:tcPr/>
+          <w:p>
             <w:pPr>
               <w:rPr/>
             </w:pPr>
@@ -2863,21 +2815,21 @@
         </w:tc>
         <w:tc>
           <w:tcPr/>
-          <w:p ns1:paraId="0000008F">
-            <w:pPr>
-              <w:rPr/>
-            </w:pPr>
-            <w:r>
-              <w:rPr>
-                <w:rtl w:val="0"/>
-              </w:rPr>
-              <w:t xml:space="preserve">Tabla de auditoría: registra fecha_sincronizacion, estado, registros_procesados y detalles de la unificación/reconciliación LWW</w:t>
+          <w:p>
+            <w:pPr>
+              <w:rPr/>
+            </w:pPr>
+            <w:r>
+              <w:rPr>
+                <w:rtl w:val="0"/>
+              </w:rPr>
+              <w:t xml:space="preserve">Tabla de auditoría: registra fecha_sincronizacion, estado, registros_procesados y detalles de reconciliación LWW</w:t>
             </w:r>
           </w:p>
         </w:tc>
       </w:tr>
     </w:tbl>
-    <w:p ns1:paraId="00000096">
+    <w:p>
       <w:pPr>
         <w:pStyle w:val="Heading2"/>
         <w:rPr/>
@@ -2889,7 +2841,7 @@
         <w:t xml:space="preserve">3.3 Diagrama Entidad–Relación (ERD)</w:t>
       </w:r>
     </w:p>
-    <w:p ns1:paraId="00000097">
+    <w:p>
       <w:pPr>
         <w:jc w:val="center"/>
         <w:rPr/>
@@ -2897,36 +2849,36 @@
       <w:r>
         <w:rPr/>
         <w:drawing>
-          <ns2:inline distB="0" distT="0" distL="0" distR="0">
-            <ns2:extent cx="5760719" cy="4267101"/>
-            <ns2:effectExtent b="0" l="0" r="0" t="0"/>
-            <ns2:docPr id="2" name="image5.png"/>
-            <ns3:graphic>
-              <ns3:graphicData uri="http://schemas.openxmlformats.org/drawingml/2006/picture">
-                <ns4:pic>
-                  <ns4:nvPicPr>
-                    <ns4:cNvPr id="0" name="image5.png"/>
-                    <ns4:cNvPicPr preferRelativeResize="0"/>
-                  </ns4:nvPicPr>
-                  <ns4:blipFill>
-                    <ns3:blip ns5:embed="rId9"/>
-                    <ns3:srcRect b="0" l="0" r="0" t="0"/>
-                    <ns3:stretch>
-                      <ns3:fillRect/>
-                    </ns3:stretch>
-                  </ns4:blipFill>
-                  <ns4:spPr>
-                    <ns3:xfrm>
-                      <ns3:off x="0" y="0"/>
-                      <ns3:ext cx="5760719" cy="4267101"/>
-                    </ns3:xfrm>
-                    <ns3:prstGeom prst="rect"/>
-                    <ns3:ln/>
-                  </ns4:spPr>
-                </ns4:pic>
-              </ns3:graphicData>
-            </ns3:graphic>
-          </ns2:inline>
+          <wp:inline distB="0" distT="0" distL="0" distR="0">
+            <wp:extent cx="5760719" cy="4267101"/>
+            <wp:effectExtent b="0" l="0" r="0" t="0"/>
+            <wp:docPr id="2" name="image5.png"/>
+            <a:graphic>
+              <a:graphicData uri="http://schemas.openxmlformats.org/drawingml/2006/picture">
+                <pic:pic>
+                  <pic:nvPicPr>
+                    <pic:cNvPr id="0" name="image5.png"/>
+                    <pic:cNvPicPr preferRelativeResize="0"/>
+                  </pic:nvPicPr>
+                  <pic:blipFill>
+                    <a:blip r:embed="rId9"/>
+                    <a:srcRect b="0" l="0" r="0" t="0"/>
+                    <a:stretch>
+                      <a:fillRect/>
+                    </a:stretch>
+                  </pic:blipFill>
+                  <pic:spPr>
+                    <a:xfrm>
+                      <a:off x="0" y="0"/>
+                      <a:ext cx="5760719" cy="4267101"/>
+                    </a:xfrm>
+                    <a:prstGeom prst="rect"/>
+                    <a:ln/>
+                  </pic:spPr>
+                </pic:pic>
+              </a:graphicData>
+            </a:graphic>
+          </wp:inline>
         </w:drawing>
       </w:r>
       <w:r>
@@ -2935,7 +2887,7 @@
         </w:rPr>
       </w:r>
     </w:p>
-    <w:p ns1:paraId="00000098">
+    <w:p>
       <w:pPr>
         <w:jc w:val="center"/>
         <w:rPr/>
@@ -2956,7 +2908,7 @@
         </w:rPr>
       </w:r>
     </w:p>
-    <w:p ns1:paraId="00000099">
+    <w:p>
       <w:pPr>
         <w:rPr/>
       </w:pPr>
@@ -2969,7 +2921,7 @@
         </w:rPr>
       </w:r>
     </w:p>
-    <w:p ns1:paraId="0000009A">
+    <w:p>
       <w:pPr>
         <w:pStyle w:val="Heading1"/>
         <w:rPr/>
@@ -2981,7 +2933,7 @@
         <w:t xml:space="preserve">4. Diagramas de Flujo</w:t>
       </w:r>
     </w:p>
-    <w:p ns1:paraId="0000009B">
+    <w:p>
       <w:pPr>
         <w:pStyle w:val="Heading2"/>
         <w:rPr/>
@@ -2993,7 +2945,7 @@
         <w:t xml:space="preserve">4.1 Registro de ciudadano</w:t>
       </w:r>
     </w:p>
-    <w:p ns1:paraId="0000009C">
+    <w:p>
       <w:pPr>
         <w:rPr/>
       </w:pPr>
@@ -3004,7 +2956,7 @@
         <w:t xml:space="preserve">Todo registro se guarda primero en SQLite y encola su snapshot en sync_queue; si hay conexión disponible, se dispara una sincronización inmediata en segundo plano, pero el operador nunca espera por la red.</w:t>
       </w:r>
     </w:p>
-    <w:p ns1:paraId="0000009D">
+    <w:p>
       <w:pPr>
         <w:jc w:val="center"/>
         <w:rPr/>
@@ -3012,36 +2964,36 @@
       <w:r>
         <w:rPr/>
         <w:drawing>
-          <ns2:inline distB="0" distT="0" distL="0" distR="0">
-            <ns2:extent cx="3539705" cy="6324923"/>
-            <ns2:effectExtent b="0" l="0" r="0" t="0"/>
-            <ns2:docPr id="5" name="image2.png"/>
-            <ns3:graphic>
-              <ns3:graphicData uri="http://schemas.openxmlformats.org/drawingml/2006/picture">
-                <ns4:pic>
-                  <ns4:nvPicPr>
-                    <ns4:cNvPr id="0" name="image2.png"/>
-                    <ns4:cNvPicPr preferRelativeResize="0"/>
-                  </ns4:nvPicPr>
-                  <ns4:blipFill>
-                    <ns3:blip ns5:embed="rId10"/>
-                    <ns3:srcRect b="0" l="0" r="0" t="0"/>
-                    <ns3:stretch>
-                      <ns3:fillRect/>
-                    </ns3:stretch>
-                  </ns4:blipFill>
-                  <ns4:spPr>
-                    <ns3:xfrm>
-                      <ns3:off x="0" y="0"/>
-                      <ns3:ext cx="3539705" cy="6324923"/>
-                    </ns3:xfrm>
-                    <ns3:prstGeom prst="rect"/>
-                    <ns3:ln/>
-                  </ns4:spPr>
-                </ns4:pic>
-              </ns3:graphicData>
-            </ns3:graphic>
-          </ns2:inline>
+          <wp:inline distB="0" distT="0" distL="0" distR="0">
+            <wp:extent cx="3539705" cy="6324923"/>
+            <wp:effectExtent b="0" l="0" r="0" t="0"/>
+            <wp:docPr id="5" name="image2.png"/>
+            <a:graphic>
+              <a:graphicData uri="http://schemas.openxmlformats.org/drawingml/2006/picture">
+                <pic:pic>
+                  <pic:nvPicPr>
+                    <pic:cNvPr id="0" name="image2.png"/>
+                    <pic:cNvPicPr preferRelativeResize="0"/>
+                  </pic:nvPicPr>
+                  <pic:blipFill>
+                    <a:blip r:embed="rId10"/>
+                    <a:srcRect b="0" l="0" r="0" t="0"/>
+                    <a:stretch>
+                      <a:fillRect/>
+                    </a:stretch>
+                  </pic:blipFill>
+                  <pic:spPr>
+                    <a:xfrm>
+                      <a:off x="0" y="0"/>
+                      <a:ext cx="3539705" cy="6324923"/>
+                    </a:xfrm>
+                    <a:prstGeom prst="rect"/>
+                    <a:ln/>
+                  </pic:spPr>
+                </pic:pic>
+              </a:graphicData>
+            </a:graphic>
+          </wp:inline>
         </w:drawing>
       </w:r>
       <w:r>
@@ -3050,7 +3002,7 @@
         </w:rPr>
       </w:r>
     </w:p>
-    <w:p ns1:paraId="0000009E">
+    <w:p>
       <w:pPr>
         <w:jc w:val="center"/>
         <w:rPr/>
@@ -3071,7 +3023,7 @@
         </w:rPr>
       </w:r>
     </w:p>
-    <w:p ns1:paraId="0000009F">
+    <w:p>
       <w:pPr>
         <w:pStyle w:val="Heading2"/>
         <w:rPr/>
@@ -3083,7 +3035,7 @@
         <w:t xml:space="preserve">4.2 Autenticación (login online / offline / cambio de dispositivo)</w:t>
       </w:r>
     </w:p>
-    <w:p ns1:paraId="000000A0">
+    <w:p>
       <w:pPr>
         <w:rPr/>
       </w:pPr>
@@ -3094,7 +3046,7 @@
         <w:t xml:space="preserve">El primer inicio de sesión en un dispositivo nuevo requiere conexión: ahí se valida contra el servidor y se decide si hay que desactivar otro dispositivo activo del mismo usuario. Los inicios posteriores en ese mismo dispositivo se validan localmente contra el hash cacheado, sin necesidad de red.</w:t>
       </w:r>
     </w:p>
-    <w:p ns1:paraId="000000A1">
+    <w:p>
       <w:pPr>
         <w:jc w:val="center"/>
         <w:rPr/>
@@ -3102,36 +3054,36 @@
       <w:r>
         <w:rPr/>
         <w:drawing>
-          <ns2:inline distB="0" distT="0" distL="0" distR="0">
-            <ns2:extent cx="3700008" cy="6023685"/>
-            <ns2:effectExtent b="0" l="0" r="0" t="0"/>
-            <ns2:docPr id="4" name="image6.png"/>
-            <ns3:graphic>
-              <ns3:graphicData uri="http://schemas.openxmlformats.org/drawingml/2006/picture">
-                <ns4:pic>
-                  <ns4:nvPicPr>
-                    <ns4:cNvPr id="0" name="image6.png"/>
-                    <ns4:cNvPicPr preferRelativeResize="0"/>
-                  </ns4:nvPicPr>
-                  <ns4:blipFill>
-                    <ns3:blip ns5:embed="rId11"/>
-                    <ns3:srcRect b="0" l="0" r="0" t="0"/>
-                    <ns3:stretch>
-                      <ns3:fillRect/>
-                    </ns3:stretch>
-                  </ns4:blipFill>
-                  <ns4:spPr>
-                    <ns3:xfrm>
-                      <ns3:off x="0" y="0"/>
-                      <ns3:ext cx="3700008" cy="6023685"/>
-                    </ns3:xfrm>
-                    <ns3:prstGeom prst="rect"/>
-                    <ns3:ln/>
-                  </ns4:spPr>
-                </ns4:pic>
-              </ns3:graphicData>
-            </ns3:graphic>
-          </ns2:inline>
+          <wp:inline distB="0" distT="0" distL="0" distR="0">
+            <wp:extent cx="3700008" cy="6023685"/>
+            <wp:effectExtent b="0" l="0" r="0" t="0"/>
+            <wp:docPr id="4" name="image6.png"/>
+            <a:graphic>
+              <a:graphicData uri="http://schemas.openxmlformats.org/drawingml/2006/picture">
+                <pic:pic>
+                  <pic:nvPicPr>
+                    <pic:cNvPr id="0" name="image6.png"/>
+                    <pic:cNvPicPr preferRelativeResize="0"/>
+                  </pic:nvPicPr>
+                  <pic:blipFill>
+                    <a:blip r:embed="rId11"/>
+                    <a:srcRect b="0" l="0" r="0" t="0"/>
+                    <a:stretch>
+                      <a:fillRect/>
+                    </a:stretch>
+                  </pic:blipFill>
+                  <pic:spPr>
+                    <a:xfrm>
+                      <a:off x="0" y="0"/>
+                      <a:ext cx="3700008" cy="6023685"/>
+                    </a:xfrm>
+                    <a:prstGeom prst="rect"/>
+                    <a:ln/>
+                  </pic:spPr>
+                </pic:pic>
+              </a:graphicData>
+            </a:graphic>
+          </wp:inline>
         </w:drawing>
       </w:r>
       <w:r>
@@ -3140,7 +3092,7 @@
         </w:rPr>
       </w:r>
     </w:p>
-    <w:p ns1:paraId="000000A2">
+    <w:p>
       <w:pPr>
         <w:jc w:val="center"/>
         <w:rPr/>
@@ -3161,7 +3113,7 @@
         </w:rPr>
       </w:r>
     </w:p>
-    <w:p ns1:paraId="000000A3">
+    <w:p>
       <w:pPr>
         <w:pStyle w:val="Heading2"/>
         <w:rPr/>
@@ -3173,7 +3125,7 @@
         <w:t xml:space="preserve">4.3 Sincronización (con fusión de duplicados e integridad garantizada)</w:t>
       </w:r>
     </w:p>
-    <w:p ns1:paraId="000000A4">
+    <w:p>
       <w:pPr>
         <w:rPr/>
       </w:pPr>
@@ -3184,7 +3136,7 @@
         <w:t xml:space="preserve">Cada registro de la cola se procesa de forma independiente y con transacción propia: si uno falla, los demás igual se sincronizan. El servidor detecta duplicados por numero_documento (aunque tengan uuid distinto) y los fusiona quedándose con el valor más reciente por campo; los conflictos de edición concurrente sobre la misma entidad se resuelven igual, por última modificación (last-write-wins). Un registro solo sale de la cola local cuando el servidor confirma su aplicación (ACK); si no hay ACK, se reintenta más tarde de forma idempotente.</w:t>
       </w:r>
     </w:p>
-    <w:p ns1:paraId="000000A5">
+    <w:p>
       <w:pPr>
         <w:jc w:val="center"/>
         <w:rPr/>
@@ -3192,36 +3144,36 @@
       <w:r>
         <w:rPr/>
         <w:drawing>
-          <ns2:inline distB="0" distT="0" distL="0" distR="0">
-            <ns2:extent cx="3888697" cy="6401734"/>
-            <ns2:effectExtent b="0" l="0" r="0" t="0"/>
-            <ns2:docPr id="6" name="image4.png"/>
-            <ns3:graphic>
-              <ns3:graphicData uri="http://schemas.openxmlformats.org/drawingml/2006/picture">
-                <ns4:pic>
-                  <ns4:nvPicPr>
-                    <ns4:cNvPr id="0" name="image4.png"/>
-                    <ns4:cNvPicPr preferRelativeResize="0"/>
-                  </ns4:nvPicPr>
-                  <ns4:blipFill>
-                    <ns3:blip ns5:embed="rId12"/>
-                    <ns3:srcRect b="0" l="0" r="0" t="0"/>
-                    <ns3:stretch>
-                      <ns3:fillRect/>
-                    </ns3:stretch>
-                  </ns4:blipFill>
-                  <ns4:spPr>
-                    <ns3:xfrm>
-                      <ns3:off x="0" y="0"/>
-                      <ns3:ext cx="3888697" cy="6401734"/>
-                    </ns3:xfrm>
-                    <ns3:prstGeom prst="rect"/>
-                    <ns3:ln/>
-                  </ns4:spPr>
-                </ns4:pic>
-              </ns3:graphicData>
-            </ns3:graphic>
-          </ns2:inline>
+          <wp:inline distB="0" distT="0" distL="0" distR="0">
+            <wp:extent cx="3888697" cy="6401734"/>
+            <wp:effectExtent b="0" l="0" r="0" t="0"/>
+            <wp:docPr id="6" name="image4.png"/>
+            <a:graphic>
+              <a:graphicData uri="http://schemas.openxmlformats.org/drawingml/2006/picture">
+                <pic:pic>
+                  <pic:nvPicPr>
+                    <pic:cNvPr id="0" name="image4.png"/>
+                    <pic:cNvPicPr preferRelativeResize="0"/>
+                  </pic:nvPicPr>
+                  <pic:blipFill>
+                    <a:blip r:embed="rId12"/>
+                    <a:srcRect b="0" l="0" r="0" t="0"/>
+                    <a:stretch>
+                      <a:fillRect/>
+                    </a:stretch>
+                  </pic:blipFill>
+                  <pic:spPr>
+                    <a:xfrm>
+                      <a:off x="0" y="0"/>
+                      <a:ext cx="3888697" cy="6401734"/>
+                    </a:xfrm>
+                    <a:prstGeom prst="rect"/>
+                    <a:ln/>
+                  </pic:spPr>
+                </pic:pic>
+              </a:graphicData>
+            </a:graphic>
+          </wp:inline>
         </w:drawing>
       </w:r>
       <w:r>
@@ -3230,7 +3182,7 @@
         </w:rPr>
       </w:r>
     </w:p>
-    <w:p ns1:paraId="000000A6">
+    <w:p>
       <w:pPr>
         <w:jc w:val="center"/>
         <w:rPr/>
@@ -3251,7 +3203,7 @@
         </w:rPr>
       </w:r>
     </w:p>
-    <w:p ns1:paraId="000000A7">
+    <w:p>
       <w:pPr>
         <w:rPr/>
       </w:pPr>
@@ -3264,7 +3216,7 @@
         </w:rPr>
       </w:r>
     </w:p>
-    <w:p ns1:paraId="000000A8">
+    <w:p>
       <w:pPr>
         <w:pStyle w:val="Heading1"/>
         <w:rPr/>
@@ -3311,7 +3263,7 @@
           <w:tcPr>
             <w:shd w:fill="2c5f8a" w:val="clear"/>
           </w:tcPr>
-          <w:p ns1:paraId="000000A9">
+          <w:p>
             <w:pPr>
               <w:rPr/>
             </w:pPr>
@@ -3333,7 +3285,7 @@
           <w:tcPr>
             <w:shd w:fill="2c5f8a" w:val="clear"/>
           </w:tcPr>
-          <w:p ns1:paraId="000000AA">
+          <w:p>
             <w:pPr>
               <w:rPr/>
             </w:pPr>
@@ -3359,7 +3311,7 @@
         </w:trPr>
         <w:tc>
           <w:tcPr/>
-          <w:p ns1:paraId="000000AB">
+          <w:p>
             <w:pPr>
               <w:rPr/>
             </w:pPr>
@@ -3373,7 +3325,7 @@
         </w:tc>
         <w:tc>
           <w:tcPr/>
-          <w:p ns1:paraId="000000AC">
+          <w:p>
             <w:pPr>
               <w:rPr/>
             </w:pPr>
@@ -3393,7 +3345,7 @@
         </w:trPr>
         <w:tc>
           <w:tcPr/>
-          <w:p ns1:paraId="000000AD">
+          <w:p>
             <w:pPr>
               <w:rPr/>
             </w:pPr>
@@ -3407,7 +3359,7 @@
         </w:tc>
         <w:tc>
           <w:tcPr/>
-          <w:p ns1:paraId="000000AE">
+          <w:p>
             <w:pPr>
               <w:rPr/>
             </w:pPr>
@@ -3427,7 +3379,7 @@
         </w:trPr>
         <w:tc>
           <w:tcPr/>
-          <w:p ns1:paraId="000000AF">
+          <w:p>
             <w:pPr>
               <w:rPr/>
             </w:pPr>
@@ -3441,27 +3393,27 @@
         </w:tc>
         <w:tc>
           <w:tcPr/>
-          <w:p ns1:paraId="000000B0">
-            <w:pPr>
-              <w:rPr/>
-            </w:pPr>
-            <w:r>
-              <w:rPr>
-                <w:rtl w:val="0"/>
-              </w:rPr>
-              <w:t xml:space="preserve">Permitido a partir del segundo inicio de sesión en un mismo dispositivo, validando contra el hash bcrypt de contrasena en la base SQLite local siempre que deleted_at sea nulo.</w:t>
-            </w:r>
-          </w:p>
-        </w:tc>
-      </w:tr>
-      <w:tr>
-        <w:trPr>
-          <w:cantSplit w:val="0"/>
-          <w:tblHeader w:val="0"/>
-        </w:trPr>
-        <w:tc>
-          <w:tcPr/>
-          <w:p ns1:paraId="000000B1">
+          <w:p>
+            <w:pPr>
+              <w:rPr/>
+            </w:pPr>
+            <w:r>
+              <w:rPr>
+                <w:rtl w:val="0"/>
+              </w:rPr>
+              <w:t xml:space="preserve">Permitido a partir del segundo inicio de sesión en un mismo dispositivo, validando contra un dispositivo_activo_id guardado en el primer login online.</w:t>
+            </w:r>
+          </w:p>
+        </w:tc>
+      </w:tr>
+      <w:tr>
+        <w:trPr>
+          <w:cantSplit w:val="0"/>
+          <w:tblHeader w:val="0"/>
+        </w:trPr>
+        <w:tc>
+          <w:tcPr/>
+          <w:p>
             <w:pPr>
               <w:rPr/>
             </w:pPr>
@@ -3475,7 +3427,7 @@
         </w:tc>
         <w:tc>
           <w:tcPr/>
-          <w:p ns1:paraId="000000B2">
+          <w:p>
             <w:pPr>
               <w:rPr/>
             </w:pPr>
@@ -3495,7 +3447,7 @@
         </w:trPr>
         <w:tc>
           <w:tcPr/>
-          <w:p ns1:paraId="000000B3">
+          <w:p>
             <w:pPr>
               <w:rPr/>
             </w:pPr>
@@ -3509,55 +3461,37 @@
         </w:tc>
         <w:tc>
           <w:tcPr/>
-          <w:p ns1:paraId="000000B4">
-            <w:pPr>
-              <w:rPr/>
-            </w:pPr>
-            <w:r>
-              <w:rPr>
-                <w:rtl w:val="0"/>
-              </w:rPr>
-              <w:t xml:space="preserve">Snapshot en cola + confirmación ACK antes de eliminar de la cola + procesamiento por registro (no en bloque) + idempotencia por registro_uuid+operacion+fecha.</w:t>
-            </w:r>
-          </w:p>
-        </w:tc>
-      </w:tr>
-      <w:tr>
-        <w:trPr>
-          <w:cantSplit w:val="0"/>
-          <w:tblHeader w:val="0"/>
-        </w:trPr>
-        <w:tc>
-          <w:tcPr/>
-          <w:p ns1:paraId="000000B3">
-            <w:pPr>
-              <w:rPr/>
-            </w:pPr>
-            <w:r>
-              <w:rPr>
-                <w:rtl w:val="0"/>
-              </w:rPr>
-              <w:t xml:space="preserve">Restricción de edad para ciudadanos y operadores</w:t>
-            </w:r>
-          </w:p>
-        </w:tc>
-        <w:tc>
-          <w:tcPr/>
-          <w:p ns1:paraId="000000B4">
-            <w:pPr>
-              <w:rPr/>
-            </w:pPr>
-            <w:r>
-              <w:rPr>
-                <w:rtl w:val="0"/>
-              </w:rPr>
-              <w:t xml:space="preserve">Los ciudadanos no tienen restricción de mayoría de edad (+18) y pueden ser registrados siendo menores de edad. La condición de mayoría de edad (+18) aplica únicamente para los operadores/agentes contratados que operan el sistema.</w:t>
+          <w:p>
+            <w:pPr>
+              <w:rPr/>
+            </w:pPr>
+            <w:r>
+              <w:rPr>
+                <w:rtl w:val="0"/>
+              </w:rPr>
+              <w:t xml:space="preserve">Snapshot en cola + confirmación ACK antes de eliminar de la cola + procesamiento por registro (no en bloque) + idempotencia por registro_uuid+operacion+created_at.</w:t>
+            </w:r>
+          </w:p>
+        </w:tc>
+      </w:tr>
+      <w:tr>
+        <w:tc>
+          <w:p>
+            <w:r>
+              <w:t>Restricción de edad para ciudadanos y operadores</w:t>
+            </w:r>
+          </w:p>
+        </w:tc>
+        <w:tc>
+          <w:p>
+            <w:r>
+              <w:t>Los ciudadanos no tienen restricción de mayoría de edad (+18) y pueden ser registrados siendo menores de edad. La condición de mayoría de edad (+18) aplica únicamente para los operadores/agentes contratados que operan el sistema.</w:t>
             </w:r>
           </w:p>
         </w:tc>
       </w:tr>
     </w:tbl>
-    <w:p ns1:paraId="000000B5">
+    <w:p>
       <w:pPr>
         <w:rPr/>
       </w:pPr>
@@ -3570,7 +3504,7 @@
         </w:rPr>
       </w:r>
     </w:p>
-    <w:p ns1:paraId="000000B6">
+    <w:p>
       <w:pPr>
         <w:pStyle w:val="Heading1"/>
         <w:rPr/>
@@ -3621,7 +3555,7 @@
           <w:tcPr>
             <w:shd w:fill="2c5f8a" w:val="clear"/>
           </w:tcPr>
-          <w:p ns1:paraId="000000B7">
+          <w:p>
             <w:pPr>
               <w:rPr/>
             </w:pPr>
@@ -3643,7 +3577,7 @@
           <w:tcPr>
             <w:shd w:fill="2c5f8a" w:val="clear"/>
           </w:tcPr>
-          <w:p ns1:paraId="000000B8">
+          <w:p>
             <w:pPr>
               <w:rPr/>
             </w:pPr>
@@ -3665,7 +3599,7 @@
           <w:tcPr>
             <w:shd w:fill="2c5f8a" w:val="clear"/>
           </w:tcPr>
-          <w:p ns1:paraId="000000B9">
+          <w:p>
             <w:pPr>
               <w:rPr/>
             </w:pPr>
@@ -3687,7 +3621,7 @@
           <w:tcPr>
             <w:shd w:fill="2c5f8a" w:val="clear"/>
           </w:tcPr>
-          <w:p ns1:paraId="000000BA">
+          <w:p>
             <w:pPr>
               <w:rPr/>
             </w:pPr>
@@ -3713,7 +3647,7 @@
         </w:trPr>
         <w:tc>
           <w:tcPr/>
-          <w:p ns1:paraId="000000BB">
+          <w:p>
             <w:pPr>
               <w:rPr/>
             </w:pPr>
@@ -3727,7 +3661,7 @@
         </w:tc>
         <w:tc>
           <w:tcPr/>
-          <w:p ns1:paraId="000000BC">
+          <w:p>
             <w:pPr>
               <w:rPr/>
             </w:pPr>
@@ -3741,7 +3675,7 @@
         </w:tc>
         <w:tc>
           <w:tcPr/>
-          <w:p ns1:paraId="000000BD">
+          <w:p>
             <w:pPr>
               <w:rPr/>
             </w:pPr>
@@ -3755,7 +3689,7 @@
         </w:tc>
         <w:tc>
           <w:tcPr/>
-          <w:p ns1:paraId="000000BE">
+          <w:p>
             <w:pPr>
               <w:rPr/>
             </w:pPr>
@@ -3775,7 +3709,7 @@
         </w:trPr>
         <w:tc>
           <w:tcPr/>
-          <w:p ns1:paraId="000000BF">
+          <w:p>
             <w:pPr>
               <w:rPr/>
             </w:pPr>
@@ -3789,7 +3723,7 @@
         </w:tc>
         <w:tc>
           <w:tcPr/>
-          <w:p ns1:paraId="000000C0">
+          <w:p>
             <w:pPr>
               <w:rPr/>
             </w:pPr>
@@ -3803,7 +3737,7 @@
         </w:tc>
         <w:tc>
           <w:tcPr/>
-          <w:p ns1:paraId="000000C1">
+          <w:p>
             <w:pPr>
               <w:rPr/>
             </w:pPr>
@@ -3817,7 +3751,7 @@
         </w:tc>
         <w:tc>
           <w:tcPr/>
-          <w:p ns1:paraId="000000C2">
+          <w:p>
             <w:pPr>
               <w:rPr/>
             </w:pPr>
@@ -3837,7 +3771,7 @@
         </w:trPr>
         <w:tc>
           <w:tcPr/>
-          <w:p ns1:paraId="000000C3">
+          <w:p>
             <w:pPr>
               <w:rPr/>
             </w:pPr>
@@ -3851,7 +3785,7 @@
         </w:tc>
         <w:tc>
           <w:tcPr/>
-          <w:p ns1:paraId="000000C4">
+          <w:p>
             <w:pPr>
               <w:rPr/>
             </w:pPr>
@@ -3865,7 +3799,7 @@
         </w:tc>
         <w:tc>
           <w:tcPr/>
-          <w:p ns1:paraId="000000C5">
+          <w:p>
             <w:pPr>
               <w:rPr/>
             </w:pPr>
@@ -3879,7 +3813,7 @@
         </w:tc>
         <w:tc>
           <w:tcPr/>
-          <w:p ns1:paraId="000000C6">
+          <w:p>
             <w:pPr>
               <w:rPr/>
             </w:pPr>
@@ -3899,7 +3833,7 @@
         </w:trPr>
         <w:tc>
           <w:tcPr/>
-          <w:p ns1:paraId="000000C7">
+          <w:p>
             <w:pPr>
               <w:rPr/>
             </w:pPr>
@@ -3913,7 +3847,7 @@
         </w:tc>
         <w:tc>
           <w:tcPr/>
-          <w:p ns1:paraId="000000C8">
+          <w:p>
             <w:pPr>
               <w:rPr/>
             </w:pPr>
@@ -3927,7 +3861,7 @@
         </w:tc>
         <w:tc>
           <w:tcPr/>
-          <w:p ns1:paraId="000000C9">
+          <w:p>
             <w:pPr>
               <w:rPr/>
             </w:pPr>
@@ -3941,7 +3875,7 @@
         </w:tc>
         <w:tc>
           <w:tcPr/>
-          <w:p ns1:paraId="000000CA">
+          <w:p>
             <w:pPr>
               <w:rPr/>
             </w:pPr>
@@ -3961,7 +3895,7 @@
         </w:trPr>
         <w:tc>
           <w:tcPr/>
-          <w:p ns1:paraId="000000CB">
+          <w:p>
             <w:pPr>
               <w:rPr/>
             </w:pPr>
@@ -3975,7 +3909,7 @@
         </w:tc>
         <w:tc>
           <w:tcPr/>
-          <w:p ns1:paraId="000000CC">
+          <w:p>
             <w:pPr>
               <w:rPr/>
             </w:pPr>
@@ -3989,7 +3923,7 @@
         </w:tc>
         <w:tc>
           <w:tcPr/>
-          <w:p ns1:paraId="000000CD">
+          <w:p>
             <w:pPr>
               <w:rPr/>
             </w:pPr>
@@ -4003,7 +3937,7 @@
         </w:tc>
         <w:tc>
           <w:tcPr/>
-          <w:p ns1:paraId="000000CE">
+          <w:p>
             <w:pPr>
               <w:rPr/>
             </w:pPr>
@@ -4023,7 +3957,7 @@
         </w:trPr>
         <w:tc>
           <w:tcPr/>
-          <w:p ns1:paraId="000000CF">
+          <w:p>
             <w:pPr>
               <w:rPr/>
             </w:pPr>
@@ -4037,21 +3971,21 @@
         </w:tc>
         <w:tc>
           <w:tcPr/>
-          <w:p ns1:paraId="000000D0">
-            <w:pPr>
-              <w:rPr/>
-            </w:pPr>
-            <w:r>
-              <w:rPr>
-                <w:rtl w:val="0"/>
-              </w:rPr>
-              <w:t xml:space="preserve">SyncQueue, SyncLog</w:t>
-            </w:r>
-          </w:p>
-        </w:tc>
-        <w:tc>
-          <w:tcPr/>
-          <w:p ns1:paraId="000000D1">
+          <w:p>
+            <w:pPr>
+              <w:rPr/>
+            </w:pPr>
+            <w:r>
+              <w:rPr>
+                <w:rtl w:val="0"/>
+              </w:rPr>
+              <w:t xml:space="preserve">SyncQueue, LogSincronizacion</w:t>
+            </w:r>
+          </w:p>
+        </w:tc>
+        <w:tc>
+          <w:tcPr/>
+          <w:p>
             <w:pPr>
               <w:rPr/>
             </w:pPr>
@@ -4065,7 +3999,7 @@
         </w:tc>
         <w:tc>
           <w:tcPr/>
-          <w:p ns1:paraId="000000D2">
+          <w:p>
             <w:pPr>
               <w:rPr/>
             </w:pPr>
@@ -4085,7 +4019,7 @@
         </w:trPr>
         <w:tc>
           <w:tcPr/>
-          <w:p ns1:paraId="000000D3">
+          <w:p>
             <w:pPr>
               <w:rPr/>
             </w:pPr>
@@ -4099,21 +4033,21 @@
         </w:tc>
         <w:tc>
           <w:tcPr/>
-          <w:p ns1:paraId="000000D4">
-            <w:pPr>
-              <w:rPr/>
-            </w:pPr>
-            <w:r>
-              <w:rPr>
-                <w:rtl w:val="0"/>
-              </w:rPr>
-              <w:t xml:space="preserve">SyncQueue (payload, estado), Ciudadano (version)</w:t>
-            </w:r>
-          </w:p>
-        </w:tc>
-        <w:tc>
-          <w:tcPr/>
-          <w:p ns1:paraId="000000D5">
+          <w:p>
+            <w:pPr>
+              <w:rPr/>
+            </w:pPr>
+            <w:r>
+              <w:rPr>
+                <w:rtl w:val="0"/>
+              </w:rPr>
+              <w:t xml:space="preserve">SyncQueue (payload, deleted_at), Ciudadano (version)</w:t>
+            </w:r>
+          </w:p>
+        </w:tc>
+        <w:tc>
+          <w:tcPr/>
+          <w:p>
             <w:pPr>
               <w:rPr/>
             </w:pPr>
@@ -4127,7 +4061,7 @@
         </w:tc>
         <w:tc>
           <w:tcPr/>
-          <w:p ns1:paraId="000000D6">
+          <w:p>
             <w:pPr>
               <w:rPr/>
             </w:pPr>
@@ -4147,7 +4081,7 @@
         </w:trPr>
         <w:tc>
           <w:tcPr/>
-          <w:p ns1:paraId="000000D7">
+          <w:p>
             <w:pPr>
               <w:rPr/>
             </w:pPr>
@@ -4161,7 +4095,7 @@
         </w:tc>
         <w:tc>
           <w:tcPr/>
-          <w:p ns1:paraId="000000D8">
+          <w:p>
             <w:pPr>
               <w:rPr/>
             </w:pPr>
@@ -4175,7 +4109,7 @@
         </w:tc>
         <w:tc>
           <w:tcPr/>
-          <w:p ns1:paraId="000000D9">
+          <w:p>
             <w:pPr>
               <w:rPr/>
             </w:pPr>
@@ -4189,7 +4123,7 @@
         </w:tc>
         <w:tc>
           <w:tcPr/>
-          <w:p ns1:paraId="000000DA">
+          <w:p>
             <w:pPr>
               <w:rPr/>
             </w:pPr>
@@ -4209,7 +4143,7 @@
         </w:trPr>
         <w:tc>
           <w:tcPr/>
-          <w:p ns1:paraId="000000DB">
+          <w:p>
             <w:pPr>
               <w:rPr/>
             </w:pPr>
@@ -4223,21 +4157,21 @@
         </w:tc>
         <w:tc>
           <w:tcPr/>
-          <w:p ns1:paraId="000000DC">
-            <w:pPr>
-              <w:rPr/>
-            </w:pPr>
-            <w:r>
-              <w:rPr>
-                <w:rtl w:val="0"/>
-              </w:rPr>
-              <w:t xml:space="preserve">Usuario (password_hash_cache)</w:t>
-            </w:r>
-          </w:p>
-        </w:tc>
-        <w:tc>
-          <w:tcPr/>
-          <w:p ns1:paraId="000000DD">
+          <w:p>
+            <w:pPr>
+              <w:rPr/>
+            </w:pPr>
+            <w:r>
+              <w:rPr>
+                <w:rtl w:val="0"/>
+              </w:rPr>
+              <w:t xml:space="preserve">Usuario (dispositivo_activo_id)</w:t>
+            </w:r>
+          </w:p>
+        </w:tc>
+        <w:tc>
+          <w:tcPr/>
+          <w:p>
             <w:pPr>
               <w:rPr/>
             </w:pPr>
@@ -4251,7 +4185,7 @@
         </w:tc>
         <w:tc>
           <w:tcPr/>
-          <w:p ns1:paraId="000000DE">
+          <w:p>
             <w:pPr>
               <w:rPr/>
             </w:pPr>
@@ -4271,7 +4205,7 @@
         </w:trPr>
         <w:tc>
           <w:tcPr/>
-          <w:p ns1:paraId="000000DF">
+          <w:p>
             <w:pPr>
               <w:rPr/>
             </w:pPr>
@@ -4285,21 +4219,21 @@
         </w:tc>
         <w:tc>
           <w:tcPr/>
-          <w:p ns1:paraId="000000E0">
-            <w:pPr>
-              <w:rPr/>
-            </w:pPr>
-            <w:r>
-              <w:rPr>
-                <w:rtl w:val="0"/>
-              </w:rPr>
-              <w:t xml:space="preserve">Ciudadano (numero_documento UQ), SyncLog</w:t>
-            </w:r>
-          </w:p>
-        </w:tc>
-        <w:tc>
-          <w:tcPr/>
-          <w:p ns1:paraId="000000E1">
+          <w:p>
+            <w:pPr>
+              <w:rPr/>
+            </w:pPr>
+            <w:r>
+              <w:rPr>
+                <w:rtl w:val="0"/>
+              </w:rPr>
+              <w:t xml:space="preserve">Ciudadano (numero_documento UQ), LogSincronizacion</w:t>
+            </w:r>
+          </w:p>
+        </w:tc>
+        <w:tc>
+          <w:tcPr/>
+          <w:p>
             <w:pPr>
               <w:rPr/>
             </w:pPr>
@@ -4313,7 +4247,7 @@
         </w:tc>
         <w:tc>
           <w:tcPr/>
-          <w:p ns1:paraId="000000E2">
+          <w:p>
             <w:pPr>
               <w:rPr/>
             </w:pPr>
@@ -4327,69 +4261,37 @@
         </w:tc>
       </w:tr>
       <w:tr>
-        <w:trPr>
-          <w:cantSplit w:val="0"/>
-          <w:tblHeader w:val="0"/>
-        </w:trPr>
-        <w:tc>
-          <w:tcPr/>
-          <w:p ns1:paraId="000000DF">
-            <w:pPr>
-              <w:rPr/>
-            </w:pPr>
-            <w:r>
-              <w:rPr>
-                <w:rtl w:val="0"/>
-              </w:rPr>
-              <w:t xml:space="preserve">Gestionar agentes (Admin)</w:t>
-            </w:r>
-          </w:p>
-        </w:tc>
-        <w:tc>
-          <w:tcPr/>
-          <w:p ns1:paraId="000000E0">
-            <w:pPr>
-              <w:rPr/>
-            </w:pPr>
-            <w:r>
-              <w:rPr>
-                <w:rtl w:val="0"/>
-              </w:rPr>
-              <w:t xml:space="preserve">Usuario (rol = ADMIN)</w:t>
-            </w:r>
-          </w:p>
-        </w:tc>
-        <w:tc>
-          <w:tcPr/>
-          <w:p ns1:paraId="000000E1">
-            <w:pPr>
-              <w:rPr/>
-            </w:pPr>
-            <w:r>
-              <w:rPr>
-                <w:rtl w:val="0"/>
-              </w:rPr>
-              <w:t xml:space="preserve">Módulo Auth (GET /api/auth/users, AgentesListScreen)</w:t>
-            </w:r>
-          </w:p>
-        </w:tc>
-        <w:tc>
-          <w:tcPr/>
-          <w:p ns1:paraId="000000E2">
-            <w:pPr>
-              <w:rPr/>
-            </w:pPr>
-            <w:r>
-              <w:rPr>
-                <w:rtl w:val="0"/>
-              </w:rPr>
-              <w:t xml:space="preserve">Fig. 3.1</w:t>
+        <w:tc>
+          <w:p>
+            <w:r>
+              <w:t>Gestionar agentes (Admin)</w:t>
+            </w:r>
+          </w:p>
+        </w:tc>
+        <w:tc>
+          <w:p>
+            <w:r>
+              <w:t>Usuario (rol = ADMIN)</w:t>
+            </w:r>
+          </w:p>
+        </w:tc>
+        <w:tc>
+          <w:p>
+            <w:r>
+              <w:t>Módulo Auth (GET /api/auth/users, AgentesListScreen)</w:t>
+            </w:r>
+          </w:p>
+        </w:tc>
+        <w:tc>
+          <w:p>
+            <w:r>
+              <w:t>Fig. 3.1</w:t>
             </w:r>
           </w:p>
         </w:tc>
       </w:tr>
     </w:tbl>
-    <w:p ns1:paraId="000000E3">
+    <w:p>
       <w:pPr>
         <w:rPr/>
       </w:pPr>
@@ -4399,7 +4301,7 @@
         </w:rPr>
       </w:r>
     </w:p>
-    <w:p ns1:paraId="000000E4">
+    <w:p>
       <w:pPr>
         <w:rPr/>
       </w:pPr>

</xml_diff>